<commit_message>
Add continuous email validation pipeline
Validates every lead's email in the background: always-on DNS/MX/disposable/
role-account pass every second, plus opt-in SMTP catch-all/RCPT probing and
opt-in Gmail bounce-checking, both off by default and rate-limited. Extends
EmailVerifier rather than replacing it. Updates developer docs with the new
section.

Co-Authored-By: Claude Sonnet 5 <noreply@anthropic.com>
</commit_message>
<xml_diff>
--- a/docs/LeadMine-Developer-Documentation.docx
+++ b/docs/LeadMine-Developer-Documentation.docx
@@ -32093,6 +32093,3510 @@
     <w:p>
       <w:r>
         <w:br w:type="page"/>
+      </w:r>
+    </w:p>
+    <w:p>
+      <w:r>
+        <w:br w:type="page"/>
+      </w:r>
+    </w:p>
+    <w:p>
+      <w:pPr>
+        <w:pStyle w:val="Heading1"/>
+      </w:pPr>
+      <w:r>
+        <w:t>29. Backend: Email Validation Pipeline</w:t>
+      </w:r>
+    </w:p>
+    <w:p>
+      <w:pPr>
+        <w:spacing w:after="160"/>
+      </w:pPr>
+      <w:r>
+        <w:t xml:space="preserve">A continuous background system that validates every saved lead’s email address and keeps </w:t>
+      </w:r>
+      <w:r>
+        <w:rPr>
+          <w:rFonts w:ascii="Consolas" w:hAnsi="Consolas"/>
+          <w:color w:val="A31D1D"/>
+          <w:sz w:val="19"/>
+        </w:rPr>
+        <w:t>Business.EmailStatus</w:t>
+      </w:r>
+      <w:r>
+        <w:t xml:space="preserve"> current automatically, without any user action. Added after the original per-search-only verification (§16, </w:t>
+      </w:r>
+      <w:r>
+        <w:rPr>
+          <w:rFonts w:ascii="Consolas" w:hAnsi="Consolas"/>
+          <w:color w:val="A31D1D"/>
+          <w:sz w:val="19"/>
+        </w:rPr>
+        <w:t>EmailVerifier</w:t>
+      </w:r>
+      <w:r>
+        <w:t>/</w:t>
+      </w:r>
+      <w:r>
+        <w:rPr>
+          <w:rFonts w:ascii="Consolas" w:hAnsi="Consolas"/>
+          <w:color w:val="A31D1D"/>
+          <w:sz w:val="19"/>
+        </w:rPr>
+        <w:t>VerificationService</w:t>
+      </w:r>
+      <w:r>
+        <w:t>) needed to run continuously across the whole existing lead database, not just newly discovered leads, and needed two additional, materially riskier checks (SMTP-level probing and real-mailbox bounce detection) layered on top — both opt-in, both off by default.</w:t>
+      </w:r>
+    </w:p>
+    <w:p>
+      <w:pPr>
+        <w:pStyle w:val="Heading2"/>
+      </w:pPr>
+      <w:r>
+        <w:t>29.1  Design Philosophy: Three Tiers by Risk</w:t>
+      </w:r>
+    </w:p>
+    <w:p>
+      <w:pPr>
+        <w:spacing w:after="160"/>
+      </w:pPr>
+      <w:r>
+        <w:t>The feature is deliberately split into three tiers, each with a different trust/risk profile, rather than one monolithic pipeline:</w:t>
+      </w:r>
+    </w:p>
+    <w:p>
+      <w:pPr>
+        <w:pStyle w:val="ListNumber"/>
+        <w:spacing w:after="60"/>
+      </w:pPr>
+      <w:r>
+        <w:t>**Fast pass (always on)** — normalize, syntax, DNS, MX, disposable-domain, role-account. Pure DNS traffic, the same kind every browser makes constantly. No external party is ever aware this ran. Safe to run every second against the whole lead table.</w:t>
+      </w:r>
+    </w:p>
+    <w:p>
+      <w:pPr>
+        <w:pStyle w:val="ListNumber"/>
+        <w:spacing w:after="60"/>
+      </w:pPr>
+      <w:r>
+        <w:t xml:space="preserve">**SMTP probe (opt-in, off by default)** — catch-all detection and an RCPT TO handshake against the recipient’s own mail server. </w:t>
+      </w:r>
+      <w:r>
+        <w:rPr>
+          <w:rFonts w:ascii="Consolas" w:hAnsi="Consolas"/>
+          <w:color w:val="A31D1D"/>
+          <w:sz w:val="19"/>
+        </w:rPr>
+        <w:t>EmailVerifier</w:t>
+      </w:r>
+      <w:r>
+        <w:t>’s own doc comments (§16) already documented why this is normally skipped: major providers refuse or lie about it, catch-all domains accept every address, greylisting produces false negatives, and probing at volume from one IP risks that IP being blacklisted. This tier exists as an explicit, rate-limited opt-in for users who want the stronger signal and accept that trade-off — it does not change the always-on default.</w:t>
+      </w:r>
+    </w:p>
+    <w:p>
+      <w:pPr>
+        <w:pStyle w:val="ListNumber"/>
+        <w:spacing w:after="60"/>
+      </w:pPr>
+      <w:r>
+        <w:t>**Bounce check (opt-in, off by default)** — sends a real probe email from a real mailbox and watches for delivery-failure notices over IMAP. The most powerful signal available (a real send that nobody’s server rejects), and the most consequential to get wrong: this is functionally a small outbound campaign from a real account, and an account that trips a mail provider’s abuse detection stops working entirely. Capped well under Gmail’s consumer sending limit (~500/day) with real margin, and never on by default.</w:t>
+      </w:r>
+    </w:p>
+    <w:p>
+      <w:pPr>
+        <w:spacing w:after="160"/>
+      </w:pPr>
+      <w:r>
+        <w:t>This design was reached after an explicit discussion of the trade-offs for tiers 2 and 3 — both were built exactly as requested, but deliberately shipped off, with conservative default caps, rather than defaulting to maximally aggressive settings.</w:t>
+      </w:r>
+    </w:p>
+    <w:p>
+      <w:pPr>
+        <w:pStyle w:val="Heading2"/>
+      </w:pPr>
+      <w:r>
+        <w:t>29.2  Domain Model Additions</w:t>
+      </w:r>
+    </w:p>
+    <w:p>
+      <w:pPr>
+        <w:spacing w:after="160"/>
+      </w:pPr>
+      <w:r>
+        <w:t xml:space="preserve">Migration: </w:t>
+      </w:r>
+      <w:r>
+        <w:rPr>
+          <w:rFonts w:ascii="Consolas" w:hAnsi="Consolas"/>
+          <w:color w:val="A31D1D"/>
+          <w:sz w:val="19"/>
+        </w:rPr>
+        <w:t>AddEmailValidationPipeline</w:t>
+      </w:r>
+      <w:r>
+        <w:t>.</w:t>
+      </w:r>
+    </w:p>
+    <w:tbl>
+      <w:tblPr>
+        <w:tblStyle w:val="TableGrid"/>
+        <w:tblW w:type="auto" w:w="0"/>
+        <w:jc w:val="center"/>
+        <w:tblLook w:firstColumn="1" w:firstRow="1" w:lastColumn="0" w:lastRow="0" w:noHBand="0" w:noVBand="1" w:val="04A0"/>
+      </w:tblPr>
+      <w:tblGrid>
+        <w:gridCol w:w="4320"/>
+        <w:gridCol w:w="4320"/>
+      </w:tblGrid>
+      <w:tr>
+        <w:tc>
+          <w:tcPr>
+            <w:tcW w:type="dxa" w:w="2880"/>
+            <w:shd w:val="clear" w:color="auto" w:fill="1F4E79"/>
+          </w:tcPr>
+          <w:p>
+            <w:r/>
+            <w:r>
+              <w:rPr>
+                <w:b/>
+                <w:color w:val="FFFFFF"/>
+                <w:sz w:val="20"/>
+              </w:rPr>
+              <w:t>Field (on `Business`)</w:t>
+            </w:r>
+          </w:p>
+        </w:tc>
+        <w:tc>
+          <w:tcPr>
+            <w:tcW w:type="dxa" w:w="6624"/>
+            <w:shd w:val="clear" w:color="auto" w:fill="1F4E79"/>
+          </w:tcPr>
+          <w:p>
+            <w:r/>
+            <w:r>
+              <w:rPr>
+                <w:b/>
+                <w:color w:val="FFFFFF"/>
+                <w:sz w:val="20"/>
+              </w:rPr>
+              <w:t>Purpose</w:t>
+            </w:r>
+          </w:p>
+        </w:tc>
+      </w:tr>
+      <w:tr>
+        <w:tc>
+          <w:tcPr>
+            <w:tcW w:type="dxa" w:w="2880"/>
+          </w:tcPr>
+          <w:p>
+            <w:pPr>
+              <w:spacing w:after="40"/>
+            </w:pPr>
+            <w:r>
+              <w:rPr>
+                <w:sz w:val="19"/>
+              </w:rPr>
+            </w:r>
+            <w:r>
+              <w:rPr>
+                <w:rFonts w:ascii="Consolas" w:hAnsi="Consolas"/>
+                <w:color w:val="A31D1D"/>
+                <w:sz w:val="19"/>
+              </w:rPr>
+              <w:t>EmailConfidence</w:t>
+            </w:r>
+          </w:p>
+        </w:tc>
+        <w:tc>
+          <w:tcPr>
+            <w:tcW w:type="dxa" w:w="6624"/>
+          </w:tcPr>
+          <w:p>
+            <w:pPr>
+              <w:spacing w:after="40"/>
+            </w:pPr>
+            <w:r>
+              <w:rPr>
+                <w:sz w:val="19"/>
+              </w:rPr>
+            </w:r>
+            <w:r>
+              <w:rPr>
+                <w:sz w:val="19"/>
+              </w:rPr>
+              <w:t>0-100. Null until the pipeline has evaluated the address.</w:t>
+            </w:r>
+          </w:p>
+        </w:tc>
+      </w:tr>
+      <w:tr>
+        <w:tc>
+          <w:tcPr>
+            <w:tcW w:type="dxa" w:w="2880"/>
+          </w:tcPr>
+          <w:p>
+            <w:pPr>
+              <w:spacing w:after="40"/>
+            </w:pPr>
+            <w:r>
+              <w:rPr>
+                <w:sz w:val="19"/>
+              </w:rPr>
+            </w:r>
+            <w:r>
+              <w:rPr>
+                <w:rFonts w:ascii="Consolas" w:hAnsi="Consolas"/>
+                <w:color w:val="A31D1D"/>
+                <w:sz w:val="19"/>
+              </w:rPr>
+              <w:t>EmailValidatedAt</w:t>
+            </w:r>
+          </w:p>
+        </w:tc>
+        <w:tc>
+          <w:tcPr>
+            <w:tcW w:type="dxa" w:w="6624"/>
+          </w:tcPr>
+          <w:p>
+            <w:pPr>
+              <w:spacing w:after="40"/>
+            </w:pPr>
+            <w:r>
+              <w:rPr>
+                <w:sz w:val="19"/>
+              </w:rPr>
+            </w:r>
+            <w:r>
+              <w:rPr>
+                <w:sz w:val="19"/>
+              </w:rPr>
+              <w:t xml:space="preserve">Drives the fast pass’s queue query and the </w:t>
+            </w:r>
+            <w:r>
+              <w:rPr>
+                <w:rFonts w:ascii="Consolas" w:hAnsi="Consolas"/>
+                <w:color w:val="A31D1D"/>
+                <w:sz w:val="19"/>
+              </w:rPr>
+              <w:t>RevalidateAfterDays</w:t>
+            </w:r>
+            <w:r>
+              <w:rPr>
+                <w:sz w:val="19"/>
+              </w:rPr>
+              <w:t xml:space="preserve"> periodic recheck.</w:t>
+            </w:r>
+          </w:p>
+        </w:tc>
+      </w:tr>
+      <w:tr>
+        <w:tc>
+          <w:tcPr>
+            <w:tcW w:type="dxa" w:w="2880"/>
+          </w:tcPr>
+          <w:p>
+            <w:pPr>
+              <w:spacing w:after="40"/>
+            </w:pPr>
+            <w:r>
+              <w:rPr>
+                <w:sz w:val="19"/>
+              </w:rPr>
+            </w:r>
+            <w:r>
+              <w:rPr>
+                <w:rFonts w:ascii="Consolas" w:hAnsi="Consolas"/>
+                <w:color w:val="A31D1D"/>
+                <w:sz w:val="19"/>
+              </w:rPr>
+              <w:t>EmailIsDisposable</w:t>
+            </w:r>
+          </w:p>
+        </w:tc>
+        <w:tc>
+          <w:tcPr>
+            <w:tcW w:type="dxa" w:w="6624"/>
+          </w:tcPr>
+          <w:p>
+            <w:pPr>
+              <w:spacing w:after="40"/>
+            </w:pPr>
+            <w:r>
+              <w:rPr>
+                <w:sz w:val="19"/>
+              </w:rPr>
+            </w:r>
+            <w:r>
+              <w:rPr>
+                <w:sz w:val="19"/>
+              </w:rPr>
+              <w:t xml:space="preserve">Set from </w:t>
+            </w:r>
+            <w:r>
+              <w:rPr>
+                <w:rFonts w:ascii="Consolas" w:hAnsi="Consolas"/>
+                <w:color w:val="A31D1D"/>
+                <w:sz w:val="19"/>
+              </w:rPr>
+              <w:t>EmailVerifier</w:t>
+            </w:r>
+            <w:r>
+              <w:rPr>
+                <w:sz w:val="19"/>
+              </w:rPr>
+              <w:t>’s disposable-domain check (§29.4).</w:t>
+            </w:r>
+          </w:p>
+        </w:tc>
+      </w:tr>
+      <w:tr>
+        <w:tc>
+          <w:tcPr>
+            <w:tcW w:type="dxa" w:w="2880"/>
+          </w:tcPr>
+          <w:p>
+            <w:pPr>
+              <w:spacing w:after="40"/>
+            </w:pPr>
+            <w:r>
+              <w:rPr>
+                <w:sz w:val="19"/>
+              </w:rPr>
+            </w:r>
+            <w:r>
+              <w:rPr>
+                <w:rFonts w:ascii="Consolas" w:hAnsi="Consolas"/>
+                <w:color w:val="A31D1D"/>
+                <w:sz w:val="19"/>
+              </w:rPr>
+              <w:t>EmailIsRoleAccount</w:t>
+            </w:r>
+          </w:p>
+        </w:tc>
+        <w:tc>
+          <w:tcPr>
+            <w:tcW w:type="dxa" w:w="6624"/>
+          </w:tcPr>
+          <w:p>
+            <w:pPr>
+              <w:spacing w:after="40"/>
+            </w:pPr>
+            <w:r>
+              <w:rPr>
+                <w:sz w:val="19"/>
+              </w:rPr>
+            </w:r>
+            <w:r>
+              <w:rPr>
+                <w:sz w:val="19"/>
+              </w:rPr>
+              <w:t>A shared/team mailbox (info@, sales@, ...) rather than a named person.</w:t>
+            </w:r>
+          </w:p>
+        </w:tc>
+      </w:tr>
+      <w:tr>
+        <w:tc>
+          <w:tcPr>
+            <w:tcW w:type="dxa" w:w="2880"/>
+          </w:tcPr>
+          <w:p>
+            <w:pPr>
+              <w:spacing w:after="40"/>
+            </w:pPr>
+            <w:r>
+              <w:rPr>
+                <w:sz w:val="19"/>
+              </w:rPr>
+            </w:r>
+            <w:r>
+              <w:rPr>
+                <w:rFonts w:ascii="Consolas" w:hAnsi="Consolas"/>
+                <w:color w:val="A31D1D"/>
+                <w:sz w:val="19"/>
+              </w:rPr>
+              <w:t>EmailIsCatchAll</w:t>
+            </w:r>
+          </w:p>
+        </w:tc>
+        <w:tc>
+          <w:tcPr>
+            <w:tcW w:type="dxa" w:w="6624"/>
+          </w:tcPr>
+          <w:p>
+            <w:pPr>
+              <w:spacing w:after="40"/>
+            </w:pPr>
+            <w:r>
+              <w:rPr>
+                <w:sz w:val="19"/>
+              </w:rPr>
+            </w:r>
+            <w:r>
+              <w:rPr>
+                <w:sz w:val="19"/>
+              </w:rPr>
+              <w:t>Null unless the SMTP probe ran. True means the domain accepts RCPT TO for any address, so an "accepted" result there proves nothing about this specific mailbox.</w:t>
+            </w:r>
+          </w:p>
+        </w:tc>
+      </w:tr>
+      <w:tr>
+        <w:tc>
+          <w:tcPr>
+            <w:tcW w:type="dxa" w:w="2880"/>
+          </w:tcPr>
+          <w:p>
+            <w:pPr>
+              <w:spacing w:after="40"/>
+            </w:pPr>
+            <w:r>
+              <w:rPr>
+                <w:sz w:val="19"/>
+              </w:rPr>
+            </w:r>
+            <w:r>
+              <w:rPr>
+                <w:rFonts w:ascii="Consolas" w:hAnsi="Consolas"/>
+                <w:color w:val="A31D1D"/>
+                <w:sz w:val="19"/>
+              </w:rPr>
+              <w:t>EmailValidationDetailsJson</w:t>
+            </w:r>
+          </w:p>
+        </w:tc>
+        <w:tc>
+          <w:tcPr>
+            <w:tcW w:type="dxa" w:w="6624"/>
+          </w:tcPr>
+          <w:p>
+            <w:pPr>
+              <w:spacing w:after="40"/>
+            </w:pPr>
+            <w:r>
+              <w:rPr>
+                <w:sz w:val="19"/>
+              </w:rPr>
+            </w:r>
+            <w:r>
+              <w:rPr>
+                <w:sz w:val="19"/>
+              </w:rPr>
+              <w:t>Free-form: normalized address, MX hosts used, the SMTP probe outcome. JSON rather than more columns so new diagnostic detail never needs a migration.</w:t>
+            </w:r>
+          </w:p>
+        </w:tc>
+      </w:tr>
+    </w:tbl>
+    <w:p>
+      <w:pPr>
+        <w:spacing w:after="80"/>
+      </w:pPr>
+    </w:p>
+    <w:p>
+      <w:pPr>
+        <w:spacing w:after="160"/>
+      </w:pPr>
+      <w:r>
+        <w:t xml:space="preserve">New entity </w:t>
+      </w:r>
+      <w:r>
+        <w:rPr>
+          <w:rFonts w:ascii="Consolas" w:hAnsi="Consolas"/>
+          <w:color w:val="A31D1D"/>
+          <w:sz w:val="19"/>
+        </w:rPr>
+        <w:t>EmailBounceCheck</w:t>
+      </w:r>
+      <w:r>
+        <w:t xml:space="preserve"> — one row per send-and-watch-for-bounce attempt (plain entity, not soft-deleted, cascades on its </w:t>
+      </w:r>
+      <w:r>
+        <w:rPr>
+          <w:rFonts w:ascii="Consolas" w:hAnsi="Consolas"/>
+          <w:color w:val="A31D1D"/>
+          <w:sz w:val="19"/>
+        </w:rPr>
+        <w:t>Business</w:t>
+      </w:r>
+      <w:r>
+        <w:t xml:space="preserve"> being deleted):</w:t>
+      </w:r>
+    </w:p>
+    <w:tbl>
+      <w:tblPr>
+        <w:tblStyle w:val="TableGrid"/>
+        <w:tblW w:type="auto" w:w="0"/>
+        <w:jc w:val="center"/>
+        <w:tblLook w:firstColumn="1" w:firstRow="1" w:lastColumn="0" w:lastRow="0" w:noHBand="0" w:noVBand="1" w:val="04A0"/>
+      </w:tblPr>
+      <w:tblGrid>
+        <w:gridCol w:w="4320"/>
+        <w:gridCol w:w="4320"/>
+      </w:tblGrid>
+      <w:tr>
+        <w:tc>
+          <w:tcPr>
+            <w:tcW w:type="dxa" w:w="2304"/>
+            <w:shd w:val="clear" w:color="auto" w:fill="1F4E79"/>
+          </w:tcPr>
+          <w:p>
+            <w:r/>
+            <w:r>
+              <w:rPr>
+                <w:b/>
+                <w:color w:val="FFFFFF"/>
+                <w:sz w:val="20"/>
+              </w:rPr>
+              <w:t>Field</w:t>
+            </w:r>
+          </w:p>
+        </w:tc>
+        <w:tc>
+          <w:tcPr>
+            <w:tcW w:type="dxa" w:w="7200"/>
+            <w:shd w:val="clear" w:color="auto" w:fill="1F4E79"/>
+          </w:tcPr>
+          <w:p>
+            <w:r/>
+            <w:r>
+              <w:rPr>
+                <w:b/>
+                <w:color w:val="FFFFFF"/>
+                <w:sz w:val="20"/>
+              </w:rPr>
+              <w:t>Purpose</w:t>
+            </w:r>
+          </w:p>
+        </w:tc>
+      </w:tr>
+      <w:tr>
+        <w:tc>
+          <w:tcPr>
+            <w:tcW w:type="dxa" w:w="2304"/>
+          </w:tcPr>
+          <w:p>
+            <w:pPr>
+              <w:spacing w:after="40"/>
+            </w:pPr>
+            <w:r>
+              <w:rPr>
+                <w:sz w:val="19"/>
+              </w:rPr>
+            </w:r>
+            <w:r>
+              <w:rPr>
+                <w:rFonts w:ascii="Consolas" w:hAnsi="Consolas"/>
+                <w:color w:val="A31D1D"/>
+                <w:sz w:val="19"/>
+              </w:rPr>
+              <w:t>BusinessId</w:t>
+            </w:r>
+            <w:r>
+              <w:rPr>
+                <w:sz w:val="19"/>
+              </w:rPr>
+              <w:t xml:space="preserve"> / </w:t>
+            </w:r>
+            <w:r>
+              <w:rPr>
+                <w:rFonts w:ascii="Consolas" w:hAnsi="Consolas"/>
+                <w:color w:val="A31D1D"/>
+                <w:sz w:val="19"/>
+              </w:rPr>
+              <w:t>Email</w:t>
+            </w:r>
+          </w:p>
+        </w:tc>
+        <w:tc>
+          <w:tcPr>
+            <w:tcW w:type="dxa" w:w="7200"/>
+          </w:tcPr>
+          <w:p>
+            <w:pPr>
+              <w:spacing w:after="40"/>
+            </w:pPr>
+            <w:r>
+              <w:rPr>
+                <w:sz w:val="19"/>
+              </w:rPr>
+            </w:r>
+            <w:r>
+              <w:rPr>
+                <w:sz w:val="19"/>
+              </w:rPr>
+              <w:t xml:space="preserve">The lead and the exact address the probe was sent to (kept separate from the live </w:t>
+            </w:r>
+            <w:r>
+              <w:rPr>
+                <w:rFonts w:ascii="Consolas" w:hAnsi="Consolas"/>
+                <w:color w:val="A31D1D"/>
+                <w:sz w:val="19"/>
+              </w:rPr>
+              <w:t>Business.Email</w:t>
+            </w:r>
+            <w:r>
+              <w:rPr>
+                <w:sz w:val="19"/>
+              </w:rPr>
+              <w:t xml:space="preserve"> so a later edit doesn’t orphan an in-flight check).</w:t>
+            </w:r>
+          </w:p>
+        </w:tc>
+      </w:tr>
+      <w:tr>
+        <w:tc>
+          <w:tcPr>
+            <w:tcW w:type="dxa" w:w="2304"/>
+          </w:tcPr>
+          <w:p>
+            <w:pPr>
+              <w:spacing w:after="40"/>
+            </w:pPr>
+            <w:r>
+              <w:rPr>
+                <w:sz w:val="19"/>
+              </w:rPr>
+            </w:r>
+            <w:r>
+              <w:rPr>
+                <w:rFonts w:ascii="Consolas" w:hAnsi="Consolas"/>
+                <w:color w:val="A31D1D"/>
+                <w:sz w:val="19"/>
+              </w:rPr>
+              <w:t>Status</w:t>
+            </w:r>
+          </w:p>
+        </w:tc>
+        <w:tc>
+          <w:tcPr>
+            <w:tcW w:type="dxa" w:w="7200"/>
+          </w:tcPr>
+          <w:p>
+            <w:pPr>
+              <w:spacing w:after="40"/>
+            </w:pPr>
+            <w:r>
+              <w:rPr>
+                <w:sz w:val="19"/>
+              </w:rPr>
+            </w:r>
+            <w:r>
+              <w:rPr>
+                <w:rFonts w:ascii="Consolas" w:hAnsi="Consolas"/>
+                <w:color w:val="A31D1D"/>
+                <w:sz w:val="19"/>
+              </w:rPr>
+              <w:t>EmailBounceCheckStatus</w:t>
+            </w:r>
+            <w:r>
+              <w:rPr>
+                <w:sz w:val="19"/>
+              </w:rPr>
+              <w:t xml:space="preserve">: </w:t>
+            </w:r>
+            <w:r>
+              <w:rPr>
+                <w:rFonts w:ascii="Consolas" w:hAnsi="Consolas"/>
+                <w:color w:val="A31D1D"/>
+                <w:sz w:val="19"/>
+              </w:rPr>
+              <w:t>Pending</w:t>
+            </w:r>
+            <w:r>
+              <w:rPr>
+                <w:sz w:val="19"/>
+              </w:rPr>
+              <w:t xml:space="preserve"> → </w:t>
+            </w:r>
+            <w:r>
+              <w:rPr>
+                <w:rFonts w:ascii="Consolas" w:hAnsi="Consolas"/>
+                <w:color w:val="A31D1D"/>
+                <w:sz w:val="19"/>
+              </w:rPr>
+              <w:t>Confirmed</w:t>
+            </w:r>
+            <w:r>
+              <w:rPr>
+                <w:sz w:val="19"/>
+              </w:rPr>
+              <w:t xml:space="preserve"> (no bounce arrived in the wait window) or </w:t>
+            </w:r>
+            <w:r>
+              <w:rPr>
+                <w:rFonts w:ascii="Consolas" w:hAnsi="Consolas"/>
+                <w:color w:val="A31D1D"/>
+                <w:sz w:val="19"/>
+              </w:rPr>
+              <w:t>Bounced</w:t>
+            </w:r>
+            <w:r>
+              <w:rPr>
+                <w:sz w:val="19"/>
+              </w:rPr>
+              <w:t xml:space="preserve"> (a delivery-failure notice matched) — or </w:t>
+            </w:r>
+            <w:r>
+              <w:rPr>
+                <w:rFonts w:ascii="Consolas" w:hAnsi="Consolas"/>
+                <w:color w:val="A31D1D"/>
+                <w:sz w:val="19"/>
+              </w:rPr>
+              <w:t>SendFailed</w:t>
+            </w:r>
+            <w:r>
+              <w:rPr>
+                <w:sz w:val="19"/>
+              </w:rPr>
+              <w:t xml:space="preserve"> if the probe itself never went out.</w:t>
+            </w:r>
+          </w:p>
+        </w:tc>
+      </w:tr>
+      <w:tr>
+        <w:tc>
+          <w:tcPr>
+            <w:tcW w:type="dxa" w:w="2304"/>
+          </w:tcPr>
+          <w:p>
+            <w:pPr>
+              <w:spacing w:after="40"/>
+            </w:pPr>
+            <w:r>
+              <w:rPr>
+                <w:sz w:val="19"/>
+              </w:rPr>
+            </w:r>
+            <w:r>
+              <w:rPr>
+                <w:rFonts w:ascii="Consolas" w:hAnsi="Consolas"/>
+                <w:color w:val="A31D1D"/>
+                <w:sz w:val="19"/>
+              </w:rPr>
+              <w:t>SentAt</w:t>
+            </w:r>
+            <w:r>
+              <w:rPr>
+                <w:sz w:val="19"/>
+              </w:rPr>
+              <w:t xml:space="preserve"> / </w:t>
+            </w:r>
+            <w:r>
+              <w:rPr>
+                <w:rFonts w:ascii="Consolas" w:hAnsi="Consolas"/>
+                <w:color w:val="A31D1D"/>
+                <w:sz w:val="19"/>
+              </w:rPr>
+              <w:t>ResolvedAt</w:t>
+            </w:r>
+          </w:p>
+        </w:tc>
+        <w:tc>
+          <w:tcPr>
+            <w:tcW w:type="dxa" w:w="7200"/>
+          </w:tcPr>
+          <w:p>
+            <w:pPr>
+              <w:spacing w:after="40"/>
+            </w:pPr>
+            <w:r>
+              <w:rPr>
+                <w:sz w:val="19"/>
+              </w:rPr>
+            </w:r>
+            <w:r>
+              <w:rPr>
+                <w:sz w:val="19"/>
+              </w:rPr>
+              <w:t>Drives the daily/hourly send-budget queries and the wait-window timeout sweep.</w:t>
+            </w:r>
+          </w:p>
+        </w:tc>
+      </w:tr>
+      <w:tr>
+        <w:tc>
+          <w:tcPr>
+            <w:tcW w:type="dxa" w:w="2304"/>
+          </w:tcPr>
+          <w:p>
+            <w:pPr>
+              <w:spacing w:after="40"/>
+            </w:pPr>
+            <w:r>
+              <w:rPr>
+                <w:sz w:val="19"/>
+              </w:rPr>
+            </w:r>
+            <w:r>
+              <w:rPr>
+                <w:rFonts w:ascii="Consolas" w:hAnsi="Consolas"/>
+                <w:color w:val="A31D1D"/>
+                <w:sz w:val="19"/>
+              </w:rPr>
+              <w:t>MessageId</w:t>
+            </w:r>
+          </w:p>
+        </w:tc>
+        <w:tc>
+          <w:tcPr>
+            <w:tcW w:type="dxa" w:w="7200"/>
+          </w:tcPr>
+          <w:p>
+            <w:pPr>
+              <w:spacing w:after="40"/>
+            </w:pPr>
+            <w:r>
+              <w:rPr>
+                <w:sz w:val="19"/>
+              </w:rPr>
+            </w:r>
+            <w:r>
+              <w:rPr>
+                <w:sz w:val="19"/>
+              </w:rPr>
+              <w:t xml:space="preserve">The outbound </w:t>
+            </w:r>
+            <w:r>
+              <w:rPr>
+                <w:rFonts w:ascii="Consolas" w:hAnsi="Consolas"/>
+                <w:color w:val="A31D1D"/>
+                <w:sz w:val="19"/>
+              </w:rPr>
+              <w:t>Message-Id</w:t>
+            </w:r>
+            <w:r>
+              <w:rPr>
+                <w:sz w:val="19"/>
+              </w:rPr>
+              <w:t>, for matching a DSN bounce that references the original headers.</w:t>
+            </w:r>
+          </w:p>
+        </w:tc>
+      </w:tr>
+      <w:tr>
+        <w:tc>
+          <w:tcPr>
+            <w:tcW w:type="dxa" w:w="2304"/>
+          </w:tcPr>
+          <w:p>
+            <w:pPr>
+              <w:spacing w:after="40"/>
+            </w:pPr>
+            <w:r>
+              <w:rPr>
+                <w:sz w:val="19"/>
+              </w:rPr>
+            </w:r>
+            <w:r>
+              <w:rPr>
+                <w:rFonts w:ascii="Consolas" w:hAnsi="Consolas"/>
+                <w:color w:val="A31D1D"/>
+                <w:sz w:val="19"/>
+              </w:rPr>
+              <w:t>BounceReason</w:t>
+            </w:r>
+          </w:p>
+        </w:tc>
+        <w:tc>
+          <w:tcPr>
+            <w:tcW w:type="dxa" w:w="7200"/>
+          </w:tcPr>
+          <w:p>
+            <w:pPr>
+              <w:spacing w:after="40"/>
+            </w:pPr>
+            <w:r>
+              <w:rPr>
+                <w:sz w:val="19"/>
+              </w:rPr>
+            </w:r>
+            <w:r>
+              <w:rPr>
+                <w:sz w:val="19"/>
+              </w:rPr>
+              <w:t>The bounce message’s own reason line, when one was present.</w:t>
+            </w:r>
+          </w:p>
+        </w:tc>
+      </w:tr>
+    </w:tbl>
+    <w:p>
+      <w:pPr>
+        <w:spacing w:after="80"/>
+      </w:pPr>
+    </w:p>
+    <w:p>
+      <w:pPr>
+        <w:spacing w:after="200"/>
+        <w:ind w:left="288"/>
+        <w:shd w:val="clear" w:color="auto" w:fill="FFF4CE"/>
+      </w:pPr>
+      <w:r>
+        <w:rPr>
+          <w:b/>
+        </w:rPr>
+        <w:t xml:space="preserve">EF Core detail: </w:t>
+      </w:r>
+      <w:r>
+        <w:t xml:space="preserve">Business carries a soft-delete query filter but </w:t>
+      </w:r>
+      <w:r>
+        <w:rPr>
+          <w:rFonts w:ascii="Consolas" w:hAnsi="Consolas"/>
+          <w:color w:val="A31D1D"/>
+          <w:sz w:val="19"/>
+        </w:rPr>
+        <w:t>EmailBounceCheck → Business</w:t>
+      </w:r>
+      <w:r>
+        <w:t xml:space="preserve"> is a required (non-nullable) relationship — EF Core flags that combination as a trap (a soft-deleted lead would leave a "required" navigation silently null). Fixed with a matching </w:t>
+      </w:r>
+      <w:r>
+        <w:rPr>
+          <w:rFonts w:ascii="Consolas" w:hAnsi="Consolas"/>
+          <w:color w:val="A31D1D"/>
+          <w:sz w:val="19"/>
+        </w:rPr>
+        <w:t>HasQueryFilter(c =&gt; !c.Business!.IsDeleted)</w:t>
+      </w:r>
+      <w:r>
+        <w:t xml:space="preserve"> on </w:t>
+      </w:r>
+      <w:r>
+        <w:rPr>
+          <w:rFonts w:ascii="Consolas" w:hAnsi="Consolas"/>
+          <w:color w:val="A31D1D"/>
+          <w:sz w:val="19"/>
+        </w:rPr>
+        <w:t>EmailBounceCheck</w:t>
+      </w:r>
+      <w:r>
+        <w:t xml:space="preserve"> itself.</w:t>
+      </w:r>
+    </w:p>
+    <w:p>
+      <w:pPr>
+        <w:pStyle w:val="Heading2"/>
+      </w:pPr>
+      <w:r>
+        <w:t>29.3  EmailValidationOptions Reference</w:t>
+      </w:r>
+    </w:p>
+    <w:p>
+      <w:pPr>
+        <w:spacing w:after="160"/>
+      </w:pPr>
+      <w:r>
+        <w:t xml:space="preserve">Section </w:t>
+      </w:r>
+      <w:r>
+        <w:rPr>
+          <w:rFonts w:ascii="Consolas" w:hAnsi="Consolas"/>
+          <w:color w:val="A31D1D"/>
+          <w:sz w:val="19"/>
+        </w:rPr>
+        <w:t>EmailValidation</w:t>
+      </w:r>
+      <w:r>
+        <w:t xml:space="preserve"> in configuration. </w:t>
+      </w:r>
+      <w:r>
+        <w:rPr>
+          <w:rFonts w:ascii="Consolas" w:hAnsi="Consolas"/>
+          <w:color w:val="A31D1D"/>
+          <w:sz w:val="19"/>
+        </w:rPr>
+        <w:t>BounceCheckUsername</w:t>
+      </w:r>
+      <w:r>
+        <w:t>/</w:t>
+      </w:r>
+      <w:r>
+        <w:rPr>
+          <w:rFonts w:ascii="Consolas" w:hAnsi="Consolas"/>
+          <w:color w:val="A31D1D"/>
+          <w:sz w:val="19"/>
+        </w:rPr>
+        <w:t>BounceCheckAppPassword</w:t>
+      </w:r>
+      <w:r>
+        <w:t xml:space="preserve"> are the only two required to actually enable the bounce-check tier.</w:t>
+      </w:r>
+    </w:p>
+    <w:tbl>
+      <w:tblPr>
+        <w:tblStyle w:val="TableGrid"/>
+        <w:tblW w:type="auto" w:w="0"/>
+        <w:jc w:val="center"/>
+        <w:tblLook w:firstColumn="1" w:firstRow="1" w:lastColumn="0" w:lastRow="0" w:noHBand="0" w:noVBand="1" w:val="04A0"/>
+      </w:tblPr>
+      <w:tblGrid>
+        <w:gridCol w:w="2880"/>
+        <w:gridCol w:w="2880"/>
+        <w:gridCol w:w="2880"/>
+      </w:tblGrid>
+      <w:tr>
+        <w:tc>
+          <w:tcPr>
+            <w:tcW w:type="dxa" w:w="3312"/>
+            <w:shd w:val="clear" w:color="auto" w:fill="1F4E79"/>
+          </w:tcPr>
+          <w:p>
+            <w:r/>
+            <w:r>
+              <w:rPr>
+                <w:b/>
+                <w:color w:val="FFFFFF"/>
+                <w:sz w:val="19"/>
+              </w:rPr>
+              <w:t>Key</w:t>
+            </w:r>
+          </w:p>
+        </w:tc>
+        <w:tc>
+          <w:tcPr>
+            <w:tcW w:type="dxa" w:w="2448"/>
+            <w:shd w:val="clear" w:color="auto" w:fill="1F4E79"/>
+          </w:tcPr>
+          <w:p>
+            <w:r/>
+            <w:r>
+              <w:rPr>
+                <w:b/>
+                <w:color w:val="FFFFFF"/>
+                <w:sz w:val="19"/>
+              </w:rPr>
+              <w:t>Default</w:t>
+            </w:r>
+          </w:p>
+        </w:tc>
+        <w:tc>
+          <w:tcPr>
+            <w:tcW w:type="dxa" w:w="3744"/>
+            <w:shd w:val="clear" w:color="auto" w:fill="1F4E79"/>
+          </w:tcPr>
+          <w:p>
+            <w:r/>
+            <w:r>
+              <w:rPr>
+                <w:b/>
+                <w:color w:val="FFFFFF"/>
+                <w:sz w:val="19"/>
+              </w:rPr>
+              <w:t>Purpose</w:t>
+            </w:r>
+          </w:p>
+        </w:tc>
+      </w:tr>
+      <w:tr>
+        <w:tc>
+          <w:tcPr>
+            <w:tcW w:type="dxa" w:w="3312"/>
+          </w:tcPr>
+          <w:p>
+            <w:pPr>
+              <w:spacing w:after="40"/>
+            </w:pPr>
+            <w:r>
+              <w:rPr>
+                <w:sz w:val="18"/>
+              </w:rPr>
+            </w:r>
+            <w:r>
+              <w:rPr>
+                <w:rFonts w:ascii="Consolas" w:hAnsi="Consolas"/>
+                <w:color w:val="A31D1D"/>
+                <w:sz w:val="19"/>
+              </w:rPr>
+              <w:t>Enabled</w:t>
+            </w:r>
+          </w:p>
+        </w:tc>
+        <w:tc>
+          <w:tcPr>
+            <w:tcW w:type="dxa" w:w="2448"/>
+          </w:tcPr>
+          <w:p>
+            <w:pPr>
+              <w:spacing w:after="40"/>
+            </w:pPr>
+            <w:r>
+              <w:rPr>
+                <w:sz w:val="18"/>
+              </w:rPr>
+            </w:r>
+            <w:r>
+              <w:rPr>
+                <w:sz w:val="18"/>
+              </w:rPr>
+              <w:t>true</w:t>
+            </w:r>
+          </w:p>
+        </w:tc>
+        <w:tc>
+          <w:tcPr>
+            <w:tcW w:type="dxa" w:w="3744"/>
+          </w:tcPr>
+          <w:p>
+            <w:pPr>
+              <w:spacing w:after="40"/>
+            </w:pPr>
+            <w:r>
+              <w:rPr>
+                <w:sz w:val="18"/>
+              </w:rPr>
+            </w:r>
+            <w:r>
+              <w:rPr>
+                <w:sz w:val="18"/>
+              </w:rPr>
+              <w:t>Master switch for both background workers.</w:t>
+            </w:r>
+          </w:p>
+        </w:tc>
+      </w:tr>
+      <w:tr>
+        <w:tc>
+          <w:tcPr>
+            <w:tcW w:type="dxa" w:w="3312"/>
+          </w:tcPr>
+          <w:p>
+            <w:pPr>
+              <w:spacing w:after="40"/>
+            </w:pPr>
+            <w:r>
+              <w:rPr>
+                <w:sz w:val="18"/>
+              </w:rPr>
+            </w:r>
+            <w:r>
+              <w:rPr>
+                <w:rFonts w:ascii="Consolas" w:hAnsi="Consolas"/>
+                <w:color w:val="A31D1D"/>
+                <w:sz w:val="19"/>
+              </w:rPr>
+              <w:t>PollSeconds</w:t>
+            </w:r>
+          </w:p>
+        </w:tc>
+        <w:tc>
+          <w:tcPr>
+            <w:tcW w:type="dxa" w:w="2448"/>
+          </w:tcPr>
+          <w:p>
+            <w:pPr>
+              <w:spacing w:after="40"/>
+            </w:pPr>
+            <w:r>
+              <w:rPr>
+                <w:sz w:val="18"/>
+              </w:rPr>
+            </w:r>
+            <w:r>
+              <w:rPr>
+                <w:sz w:val="18"/>
+              </w:rPr>
+              <w:t>1</w:t>
+            </w:r>
+          </w:p>
+        </w:tc>
+        <w:tc>
+          <w:tcPr>
+            <w:tcW w:type="dxa" w:w="3744"/>
+          </w:tcPr>
+          <w:p>
+            <w:pPr>
+              <w:spacing w:after="40"/>
+            </w:pPr>
+            <w:r>
+              <w:rPr>
+                <w:sz w:val="18"/>
+              </w:rPr>
+            </w:r>
+            <w:r>
+              <w:rPr>
+                <w:sz w:val="18"/>
+              </w:rPr>
+              <w:t>Fast-pass tick interval — genuinely "every second", safe because each tick is a small batch of pure DNS work.</w:t>
+            </w:r>
+          </w:p>
+        </w:tc>
+      </w:tr>
+      <w:tr>
+        <w:tc>
+          <w:tcPr>
+            <w:tcW w:type="dxa" w:w="3312"/>
+          </w:tcPr>
+          <w:p>
+            <w:pPr>
+              <w:spacing w:after="40"/>
+            </w:pPr>
+            <w:r>
+              <w:rPr>
+                <w:sz w:val="18"/>
+              </w:rPr>
+            </w:r>
+            <w:r>
+              <w:rPr>
+                <w:rFonts w:ascii="Consolas" w:hAnsi="Consolas"/>
+                <w:color w:val="A31D1D"/>
+                <w:sz w:val="19"/>
+              </w:rPr>
+              <w:t>BatchSize</w:t>
+            </w:r>
+          </w:p>
+        </w:tc>
+        <w:tc>
+          <w:tcPr>
+            <w:tcW w:type="dxa" w:w="2448"/>
+          </w:tcPr>
+          <w:p>
+            <w:pPr>
+              <w:spacing w:after="40"/>
+            </w:pPr>
+            <w:r>
+              <w:rPr>
+                <w:sz w:val="18"/>
+              </w:rPr>
+            </w:r>
+            <w:r>
+              <w:rPr>
+                <w:sz w:val="18"/>
+              </w:rPr>
+              <w:t>10</w:t>
+            </w:r>
+          </w:p>
+        </w:tc>
+        <w:tc>
+          <w:tcPr>
+            <w:tcW w:type="dxa" w:w="3744"/>
+          </w:tcPr>
+          <w:p>
+            <w:pPr>
+              <w:spacing w:after="40"/>
+            </w:pPr>
+            <w:r>
+              <w:rPr>
+                <w:sz w:val="18"/>
+              </w:rPr>
+            </w:r>
+            <w:r>
+              <w:rPr>
+                <w:sz w:val="18"/>
+              </w:rPr>
+              <w:t>Leads validated per tick, in parallel (§29.6).</w:t>
+            </w:r>
+          </w:p>
+        </w:tc>
+      </w:tr>
+      <w:tr>
+        <w:tc>
+          <w:tcPr>
+            <w:tcW w:type="dxa" w:w="3312"/>
+          </w:tcPr>
+          <w:p>
+            <w:pPr>
+              <w:spacing w:after="40"/>
+            </w:pPr>
+            <w:r>
+              <w:rPr>
+                <w:sz w:val="18"/>
+              </w:rPr>
+            </w:r>
+            <w:r>
+              <w:rPr>
+                <w:rFonts w:ascii="Consolas" w:hAnsi="Consolas"/>
+                <w:color w:val="A31D1D"/>
+                <w:sz w:val="19"/>
+              </w:rPr>
+              <w:t>RevalidateAfterDays</w:t>
+            </w:r>
+          </w:p>
+        </w:tc>
+        <w:tc>
+          <w:tcPr>
+            <w:tcW w:type="dxa" w:w="2448"/>
+          </w:tcPr>
+          <w:p>
+            <w:pPr>
+              <w:spacing w:after="40"/>
+            </w:pPr>
+            <w:r>
+              <w:rPr>
+                <w:sz w:val="18"/>
+              </w:rPr>
+            </w:r>
+            <w:r>
+              <w:rPr>
+                <w:sz w:val="18"/>
+              </w:rPr>
+              <w:t>30</w:t>
+            </w:r>
+          </w:p>
+        </w:tc>
+        <w:tc>
+          <w:tcPr>
+            <w:tcW w:type="dxa" w:w="3744"/>
+          </w:tcPr>
+          <w:p>
+            <w:pPr>
+              <w:spacing w:after="40"/>
+            </w:pPr>
+            <w:r>
+              <w:rPr>
+                <w:sz w:val="18"/>
+              </w:rPr>
+            </w:r>
+            <w:r>
+              <w:rPr>
+                <w:sz w:val="18"/>
+              </w:rPr>
+              <w:t>A validated lead is periodically rechecked — DNS/MX records do change.</w:t>
+            </w:r>
+          </w:p>
+        </w:tc>
+      </w:tr>
+      <w:tr>
+        <w:tc>
+          <w:tcPr>
+            <w:tcW w:type="dxa" w:w="3312"/>
+          </w:tcPr>
+          <w:p>
+            <w:pPr>
+              <w:spacing w:after="40"/>
+            </w:pPr>
+            <w:r>
+              <w:rPr>
+                <w:sz w:val="18"/>
+              </w:rPr>
+            </w:r>
+            <w:r>
+              <w:rPr>
+                <w:rFonts w:ascii="Consolas" w:hAnsi="Consolas"/>
+                <w:color w:val="A31D1D"/>
+                <w:sz w:val="19"/>
+              </w:rPr>
+              <w:t>EnableSmtpProbe</w:t>
+            </w:r>
+          </w:p>
+        </w:tc>
+        <w:tc>
+          <w:tcPr>
+            <w:tcW w:type="dxa" w:w="2448"/>
+          </w:tcPr>
+          <w:p>
+            <w:pPr>
+              <w:spacing w:after="40"/>
+            </w:pPr>
+            <w:r>
+              <w:rPr>
+                <w:sz w:val="18"/>
+              </w:rPr>
+            </w:r>
+            <w:r>
+              <w:rPr>
+                <w:sz w:val="18"/>
+              </w:rPr>
+              <w:t>false</w:t>
+            </w:r>
+          </w:p>
+        </w:tc>
+        <w:tc>
+          <w:tcPr>
+            <w:tcW w:type="dxa" w:w="3744"/>
+          </w:tcPr>
+          <w:p>
+            <w:pPr>
+              <w:spacing w:after="40"/>
+            </w:pPr>
+            <w:r>
+              <w:rPr>
+                <w:sz w:val="18"/>
+              </w:rPr>
+            </w:r>
+            <w:r>
+              <w:rPr>
+                <w:sz w:val="18"/>
+              </w:rPr>
+              <w:t>Tier 2 master switch.</w:t>
+            </w:r>
+          </w:p>
+        </w:tc>
+      </w:tr>
+      <w:tr>
+        <w:tc>
+          <w:tcPr>
+            <w:tcW w:type="dxa" w:w="3312"/>
+          </w:tcPr>
+          <w:p>
+            <w:pPr>
+              <w:spacing w:after="40"/>
+            </w:pPr>
+            <w:r>
+              <w:rPr>
+                <w:sz w:val="18"/>
+              </w:rPr>
+            </w:r>
+            <w:r>
+              <w:rPr>
+                <w:rFonts w:ascii="Consolas" w:hAnsi="Consolas"/>
+                <w:color w:val="A31D1D"/>
+                <w:sz w:val="19"/>
+              </w:rPr>
+              <w:t>SmtpProbePollSeconds</w:t>
+            </w:r>
+            <w:r>
+              <w:rPr>
+                <w:sz w:val="18"/>
+              </w:rPr>
+              <w:t xml:space="preserve"> / </w:t>
+            </w:r>
+            <w:r>
+              <w:rPr>
+                <w:rFonts w:ascii="Consolas" w:hAnsi="Consolas"/>
+                <w:color w:val="A31D1D"/>
+                <w:sz w:val="19"/>
+              </w:rPr>
+              <w:t>SmtpProbeBatchSize</w:t>
+            </w:r>
+          </w:p>
+        </w:tc>
+        <w:tc>
+          <w:tcPr>
+            <w:tcW w:type="dxa" w:w="2448"/>
+          </w:tcPr>
+          <w:p>
+            <w:pPr>
+              <w:spacing w:after="40"/>
+            </w:pPr>
+            <w:r>
+              <w:rPr>
+                <w:sz w:val="18"/>
+              </w:rPr>
+            </w:r>
+            <w:r>
+              <w:rPr>
+                <w:sz w:val="18"/>
+              </w:rPr>
+              <w:t>20 / 3</w:t>
+            </w:r>
+          </w:p>
+        </w:tc>
+        <w:tc>
+          <w:tcPr>
+            <w:tcW w:type="dxa" w:w="3744"/>
+          </w:tcPr>
+          <w:p>
+            <w:pPr>
+              <w:spacing w:after="40"/>
+            </w:pPr>
+            <w:r>
+              <w:rPr>
+                <w:sz w:val="18"/>
+              </w:rPr>
+            </w:r>
+            <w:r>
+              <w:rPr>
+                <w:sz w:val="18"/>
+              </w:rPr>
+              <w:t>Deliberately slower and smaller than the fast pass.</w:t>
+            </w:r>
+          </w:p>
+        </w:tc>
+      </w:tr>
+      <w:tr>
+        <w:tc>
+          <w:tcPr>
+            <w:tcW w:type="dxa" w:w="3312"/>
+          </w:tcPr>
+          <w:p>
+            <w:pPr>
+              <w:spacing w:after="40"/>
+            </w:pPr>
+            <w:r>
+              <w:rPr>
+                <w:sz w:val="18"/>
+              </w:rPr>
+            </w:r>
+            <w:r>
+              <w:rPr>
+                <w:rFonts w:ascii="Consolas" w:hAnsi="Consolas"/>
+                <w:color w:val="A31D1D"/>
+                <w:sz w:val="19"/>
+              </w:rPr>
+              <w:t>SmtpProbeMaxPerHourPerDomain</w:t>
+            </w:r>
+          </w:p>
+        </w:tc>
+        <w:tc>
+          <w:tcPr>
+            <w:tcW w:type="dxa" w:w="2448"/>
+          </w:tcPr>
+          <w:p>
+            <w:pPr>
+              <w:spacing w:after="40"/>
+            </w:pPr>
+            <w:r>
+              <w:rPr>
+                <w:sz w:val="18"/>
+              </w:rPr>
+            </w:r>
+            <w:r>
+              <w:rPr>
+                <w:sz w:val="18"/>
+              </w:rPr>
+              <w:t>15</w:t>
+            </w:r>
+          </w:p>
+        </w:tc>
+        <w:tc>
+          <w:tcPr>
+            <w:tcW w:type="dxa" w:w="3744"/>
+          </w:tcPr>
+          <w:p>
+            <w:pPr>
+              <w:spacing w:after="40"/>
+            </w:pPr>
+            <w:r>
+              <w:rPr>
+                <w:sz w:val="18"/>
+              </w:rPr>
+            </w:r>
+            <w:r>
+              <w:rPr>
+                <w:sz w:val="18"/>
+              </w:rPr>
+              <w:t>The actual guard against hammering one provider’s mail servers.</w:t>
+            </w:r>
+          </w:p>
+        </w:tc>
+      </w:tr>
+      <w:tr>
+        <w:tc>
+          <w:tcPr>
+            <w:tcW w:type="dxa" w:w="3312"/>
+          </w:tcPr>
+          <w:p>
+            <w:pPr>
+              <w:spacing w:after="40"/>
+            </w:pPr>
+            <w:r>
+              <w:rPr>
+                <w:sz w:val="18"/>
+              </w:rPr>
+            </w:r>
+            <w:r>
+              <w:rPr>
+                <w:rFonts w:ascii="Consolas" w:hAnsi="Consolas"/>
+                <w:color w:val="A31D1D"/>
+                <w:sz w:val="19"/>
+              </w:rPr>
+              <w:t>EnableBounceCheck</w:t>
+            </w:r>
+          </w:p>
+        </w:tc>
+        <w:tc>
+          <w:tcPr>
+            <w:tcW w:type="dxa" w:w="2448"/>
+          </w:tcPr>
+          <w:p>
+            <w:pPr>
+              <w:spacing w:after="40"/>
+            </w:pPr>
+            <w:r>
+              <w:rPr>
+                <w:sz w:val="18"/>
+              </w:rPr>
+            </w:r>
+            <w:r>
+              <w:rPr>
+                <w:sz w:val="18"/>
+              </w:rPr>
+              <w:t>false</w:t>
+            </w:r>
+          </w:p>
+        </w:tc>
+        <w:tc>
+          <w:tcPr>
+            <w:tcW w:type="dxa" w:w="3744"/>
+          </w:tcPr>
+          <w:p>
+            <w:pPr>
+              <w:spacing w:after="40"/>
+            </w:pPr>
+            <w:r>
+              <w:rPr>
+                <w:sz w:val="18"/>
+              </w:rPr>
+            </w:r>
+            <w:r>
+              <w:rPr>
+                <w:sz w:val="18"/>
+              </w:rPr>
+              <w:t>Tier 3 master switch.</w:t>
+            </w:r>
+          </w:p>
+        </w:tc>
+      </w:tr>
+      <w:tr>
+        <w:tc>
+          <w:tcPr>
+            <w:tcW w:type="dxa" w:w="3312"/>
+          </w:tcPr>
+          <w:p>
+            <w:pPr>
+              <w:spacing w:after="40"/>
+            </w:pPr>
+            <w:r>
+              <w:rPr>
+                <w:sz w:val="18"/>
+              </w:rPr>
+            </w:r>
+            <w:r>
+              <w:rPr>
+                <w:rFonts w:ascii="Consolas" w:hAnsi="Consolas"/>
+                <w:color w:val="A31D1D"/>
+                <w:sz w:val="19"/>
+              </w:rPr>
+              <w:t>BounceCheckMaxPerDay</w:t>
+            </w:r>
+            <w:r>
+              <w:rPr>
+                <w:sz w:val="18"/>
+              </w:rPr>
+              <w:t xml:space="preserve"> / </w:t>
+            </w:r>
+            <w:r>
+              <w:rPr>
+                <w:rFonts w:ascii="Consolas" w:hAnsi="Consolas"/>
+                <w:color w:val="A31D1D"/>
+                <w:sz w:val="19"/>
+              </w:rPr>
+              <w:t>MaxPerHour</w:t>
+            </w:r>
+          </w:p>
+        </w:tc>
+        <w:tc>
+          <w:tcPr>
+            <w:tcW w:type="dxa" w:w="2448"/>
+          </w:tcPr>
+          <w:p>
+            <w:pPr>
+              <w:spacing w:after="40"/>
+            </w:pPr>
+            <w:r>
+              <w:rPr>
+                <w:sz w:val="18"/>
+              </w:rPr>
+            </w:r>
+            <w:r>
+              <w:rPr>
+                <w:sz w:val="18"/>
+              </w:rPr>
+              <w:t>400 / 40</w:t>
+            </w:r>
+          </w:p>
+        </w:tc>
+        <w:tc>
+          <w:tcPr>
+            <w:tcW w:type="dxa" w:w="3744"/>
+          </w:tcPr>
+          <w:p>
+            <w:pPr>
+              <w:spacing w:after="40"/>
+            </w:pPr>
+            <w:r>
+              <w:rPr>
+                <w:sz w:val="18"/>
+              </w:rPr>
+            </w:r>
+            <w:r>
+              <w:rPr>
+                <w:sz w:val="18"/>
+              </w:rPr>
+              <w:t>Comfortably under Gmail’s ~500/day consumer limit, spread across the day rather than bursting.</w:t>
+            </w:r>
+          </w:p>
+        </w:tc>
+      </w:tr>
+      <w:tr>
+        <w:tc>
+          <w:tcPr>
+            <w:tcW w:type="dxa" w:w="3312"/>
+          </w:tcPr>
+          <w:p>
+            <w:pPr>
+              <w:spacing w:after="40"/>
+            </w:pPr>
+            <w:r>
+              <w:rPr>
+                <w:sz w:val="18"/>
+              </w:rPr>
+            </w:r>
+            <w:r>
+              <w:rPr>
+                <w:rFonts w:ascii="Consolas" w:hAnsi="Consolas"/>
+                <w:color w:val="A31D1D"/>
+                <w:sz w:val="19"/>
+              </w:rPr>
+              <w:t>BounceCheckWaitHours</w:t>
+            </w:r>
+          </w:p>
+        </w:tc>
+        <w:tc>
+          <w:tcPr>
+            <w:tcW w:type="dxa" w:w="2448"/>
+          </w:tcPr>
+          <w:p>
+            <w:pPr>
+              <w:spacing w:after="40"/>
+            </w:pPr>
+            <w:r>
+              <w:rPr>
+                <w:sz w:val="18"/>
+              </w:rPr>
+            </w:r>
+            <w:r>
+              <w:rPr>
+                <w:sz w:val="18"/>
+              </w:rPr>
+              <w:t>48</w:t>
+            </w:r>
+          </w:p>
+        </w:tc>
+        <w:tc>
+          <w:tcPr>
+            <w:tcW w:type="dxa" w:w="3744"/>
+          </w:tcPr>
+          <w:p>
+            <w:pPr>
+              <w:spacing w:after="40"/>
+            </w:pPr>
+            <w:r>
+              <w:rPr>
+                <w:sz w:val="18"/>
+              </w:rPr>
+            </w:r>
+            <w:r>
+              <w:rPr>
+                <w:sz w:val="18"/>
+              </w:rPr>
+              <w:t>How long a sent probe waits for a bounce before being treated as confirmed deliverable.</w:t>
+            </w:r>
+          </w:p>
+        </w:tc>
+      </w:tr>
+      <w:tr>
+        <w:tc>
+          <w:tcPr>
+            <w:tcW w:type="dxa" w:w="3312"/>
+          </w:tcPr>
+          <w:p>
+            <w:pPr>
+              <w:spacing w:after="40"/>
+            </w:pPr>
+            <w:r>
+              <w:rPr>
+                <w:sz w:val="18"/>
+              </w:rPr>
+            </w:r>
+            <w:r>
+              <w:rPr>
+                <w:rFonts w:ascii="Consolas" w:hAnsi="Consolas"/>
+                <w:color w:val="A31D1D"/>
+                <w:sz w:val="19"/>
+              </w:rPr>
+              <w:t>BounceCheckMinConfidence</w:t>
+            </w:r>
+          </w:p>
+        </w:tc>
+        <w:tc>
+          <w:tcPr>
+            <w:tcW w:type="dxa" w:w="2448"/>
+          </w:tcPr>
+          <w:p>
+            <w:pPr>
+              <w:spacing w:after="40"/>
+            </w:pPr>
+            <w:r>
+              <w:rPr>
+                <w:sz w:val="18"/>
+              </w:rPr>
+            </w:r>
+            <w:r>
+              <w:rPr>
+                <w:sz w:val="18"/>
+              </w:rPr>
+              <w:t>50</w:t>
+            </w:r>
+          </w:p>
+        </w:tc>
+        <w:tc>
+          <w:tcPr>
+            <w:tcW w:type="dxa" w:w="3744"/>
+          </w:tcPr>
+          <w:p>
+            <w:pPr>
+              <w:spacing w:after="40"/>
+            </w:pPr>
+            <w:r>
+              <w:rPr>
+                <w:sz w:val="18"/>
+              </w:rPr>
+            </w:r>
+            <w:r>
+              <w:rPr>
+                <w:sz w:val="18"/>
+              </w:rPr>
+              <w:t>Only leads already at or above this confidence are worth spending a send on.</w:t>
+            </w:r>
+          </w:p>
+        </w:tc>
+      </w:tr>
+      <w:tr>
+        <w:tc>
+          <w:tcPr>
+            <w:tcW w:type="dxa" w:w="3312"/>
+          </w:tcPr>
+          <w:p>
+            <w:pPr>
+              <w:spacing w:after="40"/>
+            </w:pPr>
+            <w:r>
+              <w:rPr>
+                <w:sz w:val="18"/>
+              </w:rPr>
+            </w:r>
+            <w:r>
+              <w:rPr>
+                <w:rFonts w:ascii="Consolas" w:hAnsi="Consolas"/>
+                <w:color w:val="A31D1D"/>
+                <w:sz w:val="19"/>
+              </w:rPr>
+              <w:t>BounceCheckSmtpHost/Port</w:t>
+            </w:r>
+            <w:r>
+              <w:rPr>
+                <w:sz w:val="18"/>
+              </w:rPr>
+              <w:t xml:space="preserve">, </w:t>
+            </w:r>
+            <w:r>
+              <w:rPr>
+                <w:rFonts w:ascii="Consolas" w:hAnsi="Consolas"/>
+                <w:color w:val="A31D1D"/>
+                <w:sz w:val="19"/>
+              </w:rPr>
+              <w:t>BounceCheckImapHost/Port</w:t>
+            </w:r>
+          </w:p>
+        </w:tc>
+        <w:tc>
+          <w:tcPr>
+            <w:tcW w:type="dxa" w:w="2448"/>
+          </w:tcPr>
+          <w:p>
+            <w:pPr>
+              <w:spacing w:after="40"/>
+            </w:pPr>
+            <w:r>
+              <w:rPr>
+                <w:sz w:val="18"/>
+              </w:rPr>
+            </w:r>
+            <w:r>
+              <w:rPr>
+                <w:sz w:val="18"/>
+              </w:rPr>
+              <w:t>smtp.gmail.com:587, imap.gmail.com:993</w:t>
+            </w:r>
+          </w:p>
+        </w:tc>
+        <w:tc>
+          <w:tcPr>
+            <w:tcW w:type="dxa" w:w="3744"/>
+          </w:tcPr>
+          <w:p>
+            <w:pPr>
+              <w:spacing w:after="40"/>
+            </w:pPr>
+            <w:r>
+              <w:rPr>
+                <w:sz w:val="18"/>
+              </w:rPr>
+            </w:r>
+            <w:r>
+              <w:rPr>
+                <w:sz w:val="18"/>
+              </w:rPr>
+              <w:t>Any account reachable over SMTP+IMAP with an app password works, not Gmail-specific.</w:t>
+            </w:r>
+          </w:p>
+        </w:tc>
+      </w:tr>
+      <w:tr>
+        <w:tc>
+          <w:tcPr>
+            <w:tcW w:type="dxa" w:w="3312"/>
+          </w:tcPr>
+          <w:p>
+            <w:pPr>
+              <w:spacing w:after="40"/>
+            </w:pPr>
+            <w:r>
+              <w:rPr>
+                <w:sz w:val="18"/>
+              </w:rPr>
+            </w:r>
+            <w:r>
+              <w:rPr>
+                <w:rFonts w:ascii="Consolas" w:hAnsi="Consolas"/>
+                <w:color w:val="A31D1D"/>
+                <w:sz w:val="19"/>
+              </w:rPr>
+              <w:t>BounceCheckUsername</w:t>
+            </w:r>
+            <w:r>
+              <w:rPr>
+                <w:sz w:val="18"/>
+              </w:rPr>
+              <w:t xml:space="preserve"> / </w:t>
+            </w:r>
+            <w:r>
+              <w:rPr>
+                <w:rFonts w:ascii="Consolas" w:hAnsi="Consolas"/>
+                <w:color w:val="A31D1D"/>
+                <w:sz w:val="19"/>
+              </w:rPr>
+              <w:t>BounceCheckAppPassword</w:t>
+            </w:r>
+          </w:p>
+        </w:tc>
+        <w:tc>
+          <w:tcPr>
+            <w:tcW w:type="dxa" w:w="2448"/>
+          </w:tcPr>
+          <w:p>
+            <w:pPr>
+              <w:spacing w:after="40"/>
+            </w:pPr>
+            <w:r>
+              <w:rPr>
+                <w:sz w:val="18"/>
+              </w:rPr>
+            </w:r>
+            <w:r>
+              <w:rPr>
+                <w:sz w:val="18"/>
+              </w:rPr>
+              <w:t>(blank)</w:t>
+            </w:r>
+          </w:p>
+        </w:tc>
+        <w:tc>
+          <w:tcPr>
+            <w:tcW w:type="dxa" w:w="3744"/>
+          </w:tcPr>
+          <w:p>
+            <w:pPr>
+              <w:spacing w:after="40"/>
+            </w:pPr>
+            <w:r>
+              <w:rPr>
+                <w:sz w:val="18"/>
+              </w:rPr>
+            </w:r>
+            <w:r>
+              <w:rPr>
+                <w:sz w:val="18"/>
+              </w:rPr>
+              <w:t>The probe/scan mailbox. A secret — see §29.9.</w:t>
+            </w:r>
+          </w:p>
+        </w:tc>
+      </w:tr>
+    </w:tbl>
+    <w:p>
+      <w:pPr>
+        <w:spacing w:after="80"/>
+      </w:pPr>
+    </w:p>
+    <w:p>
+      <w:pPr>
+        <w:pStyle w:val="Heading2"/>
+      </w:pPr>
+      <w:r>
+        <w:t>29.4  Pipeline Components</w:t>
+      </w:r>
+    </w:p>
+    <w:p>
+      <w:pPr>
+        <w:pStyle w:val="ListBullet"/>
+        <w:spacing w:after="60"/>
+      </w:pPr>
+      <w:r>
+        <w:t>**</w:t>
+      </w:r>
+      <w:r>
+        <w:rPr>
+          <w:rFonts w:ascii="Consolas" w:hAnsi="Consolas"/>
+          <w:color w:val="A31D1D"/>
+          <w:sz w:val="19"/>
+        </w:rPr>
+        <w:t>DisposableDomainList</w:t>
+      </w:r>
+      <w:r>
+        <w:t xml:space="preserve">** — ~8,300 known throwaway-mail domains (the open-source </w:t>
+      </w:r>
+      <w:r>
+        <w:rPr>
+          <w:rFonts w:ascii="Consolas" w:hAnsi="Consolas"/>
+          <w:color w:val="A31D1D"/>
+          <w:sz w:val="19"/>
+        </w:rPr>
+        <w:t>disposable-email-domains</w:t>
+      </w:r>
+      <w:r>
+        <w:t xml:space="preserve"> list), embedded as a build resource and loaded once into a case-insensitive set, rather than a short hand-maintained list.</w:t>
+      </w:r>
+    </w:p>
+    <w:p>
+      <w:pPr>
+        <w:pStyle w:val="ListBullet"/>
+        <w:spacing w:after="60"/>
+      </w:pPr>
+      <w:r>
+        <w:t>**</w:t>
+      </w:r>
+      <w:r>
+        <w:rPr>
+          <w:rFonts w:ascii="Consolas" w:hAnsi="Consolas"/>
+          <w:color w:val="A31D1D"/>
+          <w:sz w:val="19"/>
+        </w:rPr>
+        <w:t>EmailVerifier</w:t>
+      </w:r>
+      <w:r>
+        <w:t xml:space="preserve">** (existing, extended) — its </w:t>
+      </w:r>
+      <w:r>
+        <w:rPr>
+          <w:rFonts w:ascii="Consolas" w:hAnsi="Consolas"/>
+          <w:color w:val="A31D1D"/>
+          <w:sz w:val="19"/>
+        </w:rPr>
+        <w:t>EmailVerification</w:t>
+      </w:r>
+      <w:r>
+        <w:t xml:space="preserve"> result record gained </w:t>
+      </w:r>
+      <w:r>
+        <w:rPr>
+          <w:rFonts w:ascii="Consolas" w:hAnsi="Consolas"/>
+          <w:color w:val="A31D1D"/>
+          <w:sz w:val="19"/>
+        </w:rPr>
+        <w:t>IsDisposable</w:t>
+      </w:r>
+      <w:r>
+        <w:t xml:space="preserve">, </w:t>
+      </w:r>
+      <w:r>
+        <w:rPr>
+          <w:rFonts w:ascii="Consolas" w:hAnsi="Consolas"/>
+          <w:color w:val="A31D1D"/>
+          <w:sz w:val="19"/>
+        </w:rPr>
+        <w:t>IsRoleAccount</w:t>
+      </w:r>
+      <w:r>
+        <w:t xml:space="preserve">, and </w:t>
+      </w:r>
+      <w:r>
+        <w:rPr>
+          <w:rFonts w:ascii="Consolas" w:hAnsi="Consolas"/>
+          <w:color w:val="A31D1D"/>
+          <w:sz w:val="19"/>
+        </w:rPr>
+        <w:t>MxHosts</w:t>
+      </w:r>
+      <w:r>
+        <w:t xml:space="preserve"> fields so the new pipeline can reuse its DNS/MX/disposable/role logic directly instead of duplicating it. Its documented reasoning against SMTP probing is unchanged — that logic now lives in the separate </w:t>
+      </w:r>
+      <w:r>
+        <w:rPr>
+          <w:rFonts w:ascii="Consolas" w:hAnsi="Consolas"/>
+          <w:color w:val="A31D1D"/>
+          <w:sz w:val="19"/>
+        </w:rPr>
+        <w:t>SmtpProbe</w:t>
+      </w:r>
+      <w:r>
+        <w:t xml:space="preserve"> class instead.</w:t>
+      </w:r>
+    </w:p>
+    <w:p>
+      <w:pPr>
+        <w:pStyle w:val="ListBullet"/>
+        <w:spacing w:after="60"/>
+      </w:pPr>
+      <w:r>
+        <w:t>**</w:t>
+      </w:r>
+      <w:r>
+        <w:rPr>
+          <w:rFonts w:ascii="Consolas" w:hAnsi="Consolas"/>
+          <w:color w:val="A31D1D"/>
+          <w:sz w:val="19"/>
+        </w:rPr>
+        <w:t>SmtpProbe</w:t>
+      </w:r>
+      <w:r>
+        <w:t>** — a raw SMTP client (</w:t>
+      </w:r>
+      <w:r>
+        <w:rPr>
+          <w:rFonts w:ascii="Consolas" w:hAnsi="Consolas"/>
+          <w:color w:val="A31D1D"/>
+          <w:sz w:val="19"/>
+        </w:rPr>
+        <w:t>TcpClient</w:t>
+      </w:r>
+      <w:r>
+        <w:t xml:space="preserve">, hand-rolled protocol lines) that connects directly to a recipient domain’s own MX host and issues </w:t>
+      </w:r>
+      <w:r>
+        <w:rPr>
+          <w:rFonts w:ascii="Consolas" w:hAnsi="Consolas"/>
+          <w:color w:val="A31D1D"/>
+          <w:sz w:val="19"/>
+        </w:rPr>
+        <w:t>EHLO</w:t>
+      </w:r>
+      <w:r>
+        <w:t xml:space="preserve"> / </w:t>
+      </w:r>
+      <w:r>
+        <w:rPr>
+          <w:rFonts w:ascii="Consolas" w:hAnsi="Consolas"/>
+          <w:color w:val="A31D1D"/>
+          <w:sz w:val="19"/>
+        </w:rPr>
+        <w:t>MAIL FROM:&lt;&gt;</w:t>
+      </w:r>
+      <w:r>
+        <w:t xml:space="preserve"> (null reverse-path, the standard low-suspicion sender for a verification probe) / </w:t>
+      </w:r>
+      <w:r>
+        <w:rPr>
+          <w:rFonts w:ascii="Consolas" w:hAnsi="Consolas"/>
+          <w:color w:val="A31D1D"/>
+          <w:sz w:val="19"/>
+        </w:rPr>
+        <w:t>RCPT TO</w:t>
+      </w:r>
+      <w:r>
+        <w:t xml:space="preserve"> / </w:t>
+      </w:r>
+      <w:r>
+        <w:rPr>
+          <w:rFonts w:ascii="Consolas" w:hAnsi="Consolas"/>
+          <w:color w:val="A31D1D"/>
+          <w:sz w:val="19"/>
+        </w:rPr>
+        <w:t>QUIT</w:t>
+      </w:r>
+      <w:r>
+        <w:t xml:space="preserve"> — it never sends </w:t>
+      </w:r>
+      <w:r>
+        <w:rPr>
+          <w:rFonts w:ascii="Consolas" w:hAnsi="Consolas"/>
+          <w:color w:val="A31D1D"/>
+          <w:sz w:val="19"/>
+        </w:rPr>
+        <w:t>DATA</w:t>
+      </w:r>
+      <w:r>
+        <w:t xml:space="preserve">, so nothing is actually transmitted and nothing can bounce. Also probes a random nonexistent address at the same domain to detect a catch-all server. Any connection failure (refused, timed out, port 25 blocked — common on budget hosting) is </w:t>
+      </w:r>
+      <w:r>
+        <w:rPr>
+          <w:rFonts w:ascii="Consolas" w:hAnsi="Consolas"/>
+          <w:color w:val="A31D1D"/>
+          <w:sz w:val="19"/>
+        </w:rPr>
+        <w:t>Inconclusive</w:t>
+      </w:r>
+      <w:r>
+        <w:t>, never read as invalid.</w:t>
+      </w:r>
+    </w:p>
+    <w:p>
+      <w:pPr>
+        <w:pStyle w:val="ListBullet"/>
+        <w:spacing w:after="60"/>
+      </w:pPr>
+      <w:r>
+        <w:t>**</w:t>
+      </w:r>
+      <w:r>
+        <w:rPr>
+          <w:rFonts w:ascii="Consolas" w:hAnsi="Consolas"/>
+          <w:color w:val="A31D1D"/>
+          <w:sz w:val="19"/>
+        </w:rPr>
+        <w:t>EmailValidationPipeline</w:t>
+      </w:r>
+      <w:r>
+        <w:t xml:space="preserve">** — orchestrates the above into one </w:t>
+      </w:r>
+      <w:r>
+        <w:rPr>
+          <w:rFonts w:ascii="Consolas" w:hAnsi="Consolas"/>
+          <w:color w:val="A31D1D"/>
+          <w:sz w:val="19"/>
+        </w:rPr>
+        <w:t>ValidateAsync(email)</w:t>
+      </w:r>
+      <w:r>
+        <w:t xml:space="preserve"> call: runs </w:t>
+      </w:r>
+      <w:r>
+        <w:rPr>
+          <w:rFonts w:ascii="Consolas" w:hAnsi="Consolas"/>
+          <w:color w:val="A31D1D"/>
+          <w:sz w:val="19"/>
+        </w:rPr>
+        <w:t>EmailVerifier</w:t>
+      </w:r>
+      <w:r>
+        <w:t xml:space="preserve">, and — only if the address is worth it (not already hard-invalid, not disposable, MX hosts available) and </w:t>
+      </w:r>
+      <w:r>
+        <w:rPr>
+          <w:rFonts w:ascii="Consolas" w:hAnsi="Consolas"/>
+          <w:color w:val="A31D1D"/>
+          <w:sz w:val="19"/>
+        </w:rPr>
+        <w:t>EnableSmtpProbe</w:t>
+      </w:r>
+      <w:r>
+        <w:t xml:space="preserve"> is on — runs the catch-all check and the real-address probe, then computes a confidence score.</w:t>
+      </w:r>
+    </w:p>
+    <w:p>
+      <w:pPr>
+        <w:pStyle w:val="Heading2"/>
+      </w:pPr>
+      <w:r>
+        <w:t>29.5  Confidence Scoring</w:t>
+      </w:r>
+    </w:p>
+    <w:tbl>
+      <w:tblPr>
+        <w:tblStyle w:val="TableGrid"/>
+        <w:tblW w:type="auto" w:w="0"/>
+        <w:jc w:val="center"/>
+        <w:tblLook w:firstColumn="1" w:firstRow="1" w:lastColumn="0" w:lastRow="0" w:noHBand="0" w:noVBand="1" w:val="04A0"/>
+      </w:tblPr>
+      <w:tblGrid>
+        <w:gridCol w:w="4320"/>
+        <w:gridCol w:w="4320"/>
+      </w:tblGrid>
+      <w:tr>
+        <w:tc>
+          <w:tcPr>
+            <w:tcW w:type="dxa" w:w="5184"/>
+            <w:shd w:val="clear" w:color="auto" w:fill="1F4E79"/>
+          </w:tcPr>
+          <w:p>
+            <w:r/>
+            <w:r>
+              <w:rPr>
+                <w:b/>
+                <w:color w:val="FFFFFF"/>
+                <w:sz w:val="19"/>
+              </w:rPr>
+              <w:t>Signal</w:t>
+            </w:r>
+          </w:p>
+        </w:tc>
+        <w:tc>
+          <w:tcPr>
+            <w:tcW w:type="dxa" w:w="4320"/>
+            <w:shd w:val="clear" w:color="auto" w:fill="1F4E79"/>
+          </w:tcPr>
+          <w:p>
+            <w:r/>
+            <w:r>
+              <w:rPr>
+                <w:b/>
+                <w:color w:val="FFFFFF"/>
+                <w:sz w:val="19"/>
+              </w:rPr>
+              <w:t>Confidence</w:t>
+            </w:r>
+          </w:p>
+        </w:tc>
+      </w:tr>
+      <w:tr>
+        <w:tc>
+          <w:tcPr>
+            <w:tcW w:type="dxa" w:w="5184"/>
+          </w:tcPr>
+          <w:p>
+            <w:pPr>
+              <w:spacing w:after="40"/>
+            </w:pPr>
+            <w:r>
+              <w:rPr>
+                <w:sz w:val="18"/>
+              </w:rPr>
+            </w:r>
+            <w:r>
+              <w:rPr>
+                <w:sz w:val="18"/>
+              </w:rPr>
+              <w:t>Invalid (bad syntax / no MX / domain doesn’t exist)</w:t>
+            </w:r>
+          </w:p>
+        </w:tc>
+        <w:tc>
+          <w:tcPr>
+            <w:tcW w:type="dxa" w:w="4320"/>
+          </w:tcPr>
+          <w:p>
+            <w:pPr>
+              <w:spacing w:after="40"/>
+            </w:pPr>
+            <w:r>
+              <w:rPr>
+                <w:sz w:val="18"/>
+              </w:rPr>
+            </w:r>
+            <w:r>
+              <w:rPr>
+                <w:sz w:val="18"/>
+              </w:rPr>
+              <w:t>0</w:t>
+            </w:r>
+          </w:p>
+        </w:tc>
+      </w:tr>
+      <w:tr>
+        <w:tc>
+          <w:tcPr>
+            <w:tcW w:type="dxa" w:w="5184"/>
+          </w:tcPr>
+          <w:p>
+            <w:pPr>
+              <w:spacing w:after="40"/>
+            </w:pPr>
+            <w:r>
+              <w:rPr>
+                <w:sz w:val="18"/>
+              </w:rPr>
+            </w:r>
+            <w:r>
+              <w:rPr>
+                <w:sz w:val="18"/>
+              </w:rPr>
+              <w:t>Unknown (DNS lookup inconclusive)</w:t>
+            </w:r>
+          </w:p>
+        </w:tc>
+        <w:tc>
+          <w:tcPr>
+            <w:tcW w:type="dxa" w:w="4320"/>
+          </w:tcPr>
+          <w:p>
+            <w:pPr>
+              <w:spacing w:after="40"/>
+            </w:pPr>
+            <w:r>
+              <w:rPr>
+                <w:sz w:val="18"/>
+              </w:rPr>
+            </w:r>
+            <w:r>
+              <w:rPr>
+                <w:sz w:val="18"/>
+              </w:rPr>
+              <w:t>20</w:t>
+            </w:r>
+          </w:p>
+        </w:tc>
+      </w:tr>
+      <w:tr>
+        <w:tc>
+          <w:tcPr>
+            <w:tcW w:type="dxa" w:w="5184"/>
+          </w:tcPr>
+          <w:p>
+            <w:pPr>
+              <w:spacing w:after="40"/>
+            </w:pPr>
+            <w:r>
+              <w:rPr>
+                <w:sz w:val="18"/>
+              </w:rPr>
+            </w:r>
+            <w:r>
+              <w:rPr>
+                <w:sz w:val="18"/>
+              </w:rPr>
+              <w:t>Risky + disposable domain</w:t>
+            </w:r>
+          </w:p>
+        </w:tc>
+        <w:tc>
+          <w:tcPr>
+            <w:tcW w:type="dxa" w:w="4320"/>
+          </w:tcPr>
+          <w:p>
+            <w:pPr>
+              <w:spacing w:after="40"/>
+            </w:pPr>
+            <w:r>
+              <w:rPr>
+                <w:sz w:val="18"/>
+              </w:rPr>
+            </w:r>
+            <w:r>
+              <w:rPr>
+                <w:sz w:val="18"/>
+              </w:rPr>
+              <w:t>10</w:t>
+            </w:r>
+          </w:p>
+        </w:tc>
+      </w:tr>
+      <w:tr>
+        <w:tc>
+          <w:tcPr>
+            <w:tcW w:type="dxa" w:w="5184"/>
+          </w:tcPr>
+          <w:p>
+            <w:pPr>
+              <w:spacing w:after="40"/>
+            </w:pPr>
+            <w:r>
+              <w:rPr>
+                <w:sz w:val="18"/>
+              </w:rPr>
+            </w:r>
+            <w:r>
+              <w:rPr>
+                <w:sz w:val="18"/>
+              </w:rPr>
+              <w:t>Risky (no MX, but an A-record fallback exists)</w:t>
+            </w:r>
+          </w:p>
+        </w:tc>
+        <w:tc>
+          <w:tcPr>
+            <w:tcW w:type="dxa" w:w="4320"/>
+          </w:tcPr>
+          <w:p>
+            <w:pPr>
+              <w:spacing w:after="40"/>
+            </w:pPr>
+            <w:r>
+              <w:rPr>
+                <w:sz w:val="18"/>
+              </w:rPr>
+            </w:r>
+            <w:r>
+              <w:rPr>
+                <w:sz w:val="18"/>
+              </w:rPr>
+              <w:t>40</w:t>
+            </w:r>
+          </w:p>
+        </w:tc>
+      </w:tr>
+      <w:tr>
+        <w:tc>
+          <w:tcPr>
+            <w:tcW w:type="dxa" w:w="5184"/>
+          </w:tcPr>
+          <w:p>
+            <w:pPr>
+              <w:spacing w:after="40"/>
+            </w:pPr>
+            <w:r>
+              <w:rPr>
+                <w:sz w:val="18"/>
+              </w:rPr>
+            </w:r>
+            <w:r>
+              <w:rPr>
+                <w:sz w:val="18"/>
+              </w:rPr>
+              <w:t>Valid + role account (info@, sales@, ...)</w:t>
+            </w:r>
+          </w:p>
+        </w:tc>
+        <w:tc>
+          <w:tcPr>
+            <w:tcW w:type="dxa" w:w="4320"/>
+          </w:tcPr>
+          <w:p>
+            <w:pPr>
+              <w:spacing w:after="40"/>
+            </w:pPr>
+            <w:r>
+              <w:rPr>
+                <w:sz w:val="18"/>
+              </w:rPr>
+            </w:r>
+            <w:r>
+              <w:rPr>
+                <w:sz w:val="18"/>
+              </w:rPr>
+              <w:t>75</w:t>
+            </w:r>
+          </w:p>
+        </w:tc>
+      </w:tr>
+      <w:tr>
+        <w:tc>
+          <w:tcPr>
+            <w:tcW w:type="dxa" w:w="5184"/>
+          </w:tcPr>
+          <w:p>
+            <w:pPr>
+              <w:spacing w:after="40"/>
+            </w:pPr>
+            <w:r>
+              <w:rPr>
+                <w:sz w:val="18"/>
+              </w:rPr>
+            </w:r>
+            <w:r>
+              <w:rPr>
+                <w:sz w:val="18"/>
+              </w:rPr>
+              <w:t>Valid, named-person mailbox</w:t>
+            </w:r>
+          </w:p>
+        </w:tc>
+        <w:tc>
+          <w:tcPr>
+            <w:tcW w:type="dxa" w:w="4320"/>
+          </w:tcPr>
+          <w:p>
+            <w:pPr>
+              <w:spacing w:after="40"/>
+            </w:pPr>
+            <w:r>
+              <w:rPr>
+                <w:sz w:val="18"/>
+              </w:rPr>
+            </w:r>
+            <w:r>
+              <w:rPr>
+                <w:sz w:val="18"/>
+              </w:rPr>
+              <w:t>85</w:t>
+            </w:r>
+          </w:p>
+        </w:tc>
+      </w:tr>
+      <w:tr>
+        <w:tc>
+          <w:tcPr>
+            <w:tcW w:type="dxa" w:w="5184"/>
+          </w:tcPr>
+          <w:p>
+            <w:pPr>
+              <w:spacing w:after="40"/>
+            </w:pPr>
+            <w:r>
+              <w:rPr>
+                <w:sz w:val="18"/>
+              </w:rPr>
+            </w:r>
+            <w:r>
+              <w:rPr>
+                <w:sz w:val="18"/>
+              </w:rPr>
+              <w:t>SMTP probe: server rejected the address (550/551/553)</w:t>
+            </w:r>
+          </w:p>
+        </w:tc>
+        <w:tc>
+          <w:tcPr>
+            <w:tcW w:type="dxa" w:w="4320"/>
+          </w:tcPr>
+          <w:p>
+            <w:pPr>
+              <w:spacing w:after="40"/>
+            </w:pPr>
+            <w:r>
+              <w:rPr>
+                <w:sz w:val="18"/>
+              </w:rPr>
+            </w:r>
+            <w:r>
+              <w:rPr>
+                <w:sz w:val="18"/>
+              </w:rPr>
+              <w:t>3, forced Invalid — overrides every earlier signal</w:t>
+            </w:r>
+          </w:p>
+        </w:tc>
+      </w:tr>
+      <w:tr>
+        <w:tc>
+          <w:tcPr>
+            <w:tcW w:type="dxa" w:w="5184"/>
+          </w:tcPr>
+          <w:p>
+            <w:pPr>
+              <w:spacing w:after="40"/>
+            </w:pPr>
+            <w:r>
+              <w:rPr>
+                <w:sz w:val="18"/>
+              </w:rPr>
+            </w:r>
+            <w:r>
+              <w:rPr>
+                <w:sz w:val="18"/>
+              </w:rPr>
+              <w:t>SMTP probe: accepted, domain is catch-all</w:t>
+            </w:r>
+          </w:p>
+        </w:tc>
+        <w:tc>
+          <w:tcPr>
+            <w:tcW w:type="dxa" w:w="4320"/>
+          </w:tcPr>
+          <w:p>
+            <w:pPr>
+              <w:spacing w:after="40"/>
+            </w:pPr>
+            <w:r>
+              <w:rPr>
+                <w:sz w:val="18"/>
+              </w:rPr>
+            </w:r>
+            <w:r>
+              <w:rPr>
+                <w:sz w:val="18"/>
+              </w:rPr>
+              <w:t>capped ≥55 — an "accepted" on a catch-all proves nothing about this one mailbox</w:t>
+            </w:r>
+          </w:p>
+        </w:tc>
+      </w:tr>
+      <w:tr>
+        <w:tc>
+          <w:tcPr>
+            <w:tcW w:type="dxa" w:w="5184"/>
+          </w:tcPr>
+          <w:p>
+            <w:pPr>
+              <w:spacing w:after="40"/>
+            </w:pPr>
+            <w:r>
+              <w:rPr>
+                <w:sz w:val="18"/>
+              </w:rPr>
+            </w:r>
+            <w:r>
+              <w:rPr>
+                <w:sz w:val="18"/>
+              </w:rPr>
+              <w:t>SMTP probe: accepted, not catch-all</w:t>
+            </w:r>
+          </w:p>
+        </w:tc>
+        <w:tc>
+          <w:tcPr>
+            <w:tcW w:type="dxa" w:w="4320"/>
+          </w:tcPr>
+          <w:p>
+            <w:pPr>
+              <w:spacing w:after="40"/>
+            </w:pPr>
+            <w:r>
+              <w:rPr>
+                <w:sz w:val="18"/>
+              </w:rPr>
+            </w:r>
+            <w:r>
+              <w:rPr>
+                <w:sz w:val="18"/>
+              </w:rPr>
+              <w:t>97, forced Valid</w:t>
+            </w:r>
+          </w:p>
+        </w:tc>
+      </w:tr>
+      <w:tr>
+        <w:tc>
+          <w:tcPr>
+            <w:tcW w:type="dxa" w:w="5184"/>
+          </w:tcPr>
+          <w:p>
+            <w:pPr>
+              <w:spacing w:after="40"/>
+            </w:pPr>
+            <w:r>
+              <w:rPr>
+                <w:sz w:val="18"/>
+              </w:rPr>
+            </w:r>
+            <w:r>
+              <w:rPr>
+                <w:sz w:val="18"/>
+              </w:rPr>
+              <w:t>Bounce check: no bounce within the wait window</w:t>
+            </w:r>
+          </w:p>
+        </w:tc>
+        <w:tc>
+          <w:tcPr>
+            <w:tcW w:type="dxa" w:w="4320"/>
+          </w:tcPr>
+          <w:p>
+            <w:pPr>
+              <w:spacing w:after="40"/>
+            </w:pPr>
+            <w:r>
+              <w:rPr>
+                <w:sz w:val="18"/>
+              </w:rPr>
+            </w:r>
+            <w:r>
+              <w:rPr>
+                <w:sz w:val="18"/>
+              </w:rPr>
+              <w:t>99, forced Valid — the strongest signal available</w:t>
+            </w:r>
+          </w:p>
+        </w:tc>
+      </w:tr>
+      <w:tr>
+        <w:tc>
+          <w:tcPr>
+            <w:tcW w:type="dxa" w:w="5184"/>
+          </w:tcPr>
+          <w:p>
+            <w:pPr>
+              <w:spacing w:after="40"/>
+            </w:pPr>
+            <w:r>
+              <w:rPr>
+                <w:sz w:val="18"/>
+              </w:rPr>
+            </w:r>
+            <w:r>
+              <w:rPr>
+                <w:sz w:val="18"/>
+              </w:rPr>
+              <w:t>Bounce check: delivery-failure notice matched</w:t>
+            </w:r>
+          </w:p>
+        </w:tc>
+        <w:tc>
+          <w:tcPr>
+            <w:tcW w:type="dxa" w:w="4320"/>
+          </w:tcPr>
+          <w:p>
+            <w:pPr>
+              <w:spacing w:after="40"/>
+            </w:pPr>
+            <w:r>
+              <w:rPr>
+                <w:sz w:val="18"/>
+              </w:rPr>
+            </w:r>
+            <w:r>
+              <w:rPr>
+                <w:sz w:val="18"/>
+              </w:rPr>
+              <w:t>0, forced Invalid</w:t>
+            </w:r>
+          </w:p>
+        </w:tc>
+      </w:tr>
+    </w:tbl>
+    <w:p>
+      <w:pPr>
+        <w:spacing w:after="80"/>
+      </w:pPr>
+    </w:p>
+    <w:p>
+      <w:pPr>
+        <w:pStyle w:val="Heading2"/>
+      </w:pPr>
+      <w:r>
+        <w:t>29.6  EmailValidationWorkerService (the always-on fast pass)</w:t>
+      </w:r>
+    </w:p>
+    <w:p>
+      <w:pPr>
+        <w:spacing w:after="160"/>
+      </w:pPr>
+      <w:r>
+        <w:t xml:space="preserve">A </w:t>
+      </w:r>
+      <w:r>
+        <w:rPr>
+          <w:rFonts w:ascii="Consolas" w:hAnsi="Consolas"/>
+          <w:color w:val="A31D1D"/>
+          <w:sz w:val="19"/>
+        </w:rPr>
+        <w:t>BackgroundService</w:t>
+      </w:r>
+      <w:r>
+        <w:t xml:space="preserve">, same pattern as </w:t>
+      </w:r>
+      <w:r>
+        <w:rPr>
+          <w:rFonts w:ascii="Consolas" w:hAnsi="Consolas"/>
+          <w:color w:val="A31D1D"/>
+          <w:sz w:val="19"/>
+        </w:rPr>
+        <w:t>StaleJobReaperService</w:t>
+      </w:r>
+      <w:r>
+        <w:t xml:space="preserve"> (§11): an 8-second startup delay, then a loop ticking every </w:t>
+      </w:r>
+      <w:r>
+        <w:rPr>
+          <w:rFonts w:ascii="Consolas" w:hAnsi="Consolas"/>
+          <w:color w:val="A31D1D"/>
+          <w:sz w:val="19"/>
+        </w:rPr>
+        <w:t>PollSeconds</w:t>
+      </w:r>
+      <w:r>
+        <w:t xml:space="preserve">. Each tick selects up to </w:t>
+      </w:r>
+      <w:r>
+        <w:rPr>
+          <w:rFonts w:ascii="Consolas" w:hAnsi="Consolas"/>
+          <w:color w:val="A31D1D"/>
+          <w:sz w:val="19"/>
+        </w:rPr>
+        <w:t>BatchSize</w:t>
+      </w:r>
+      <w:r>
+        <w:t xml:space="preserve"> leads (</w:t>
+      </w:r>
+      <w:r>
+        <w:rPr>
+          <w:rFonts w:ascii="Consolas" w:hAnsi="Consolas"/>
+          <w:color w:val="A31D1D"/>
+          <w:sz w:val="19"/>
+        </w:rPr>
+        <w:t>Email &lt;&gt; ''</w:t>
+      </w:r>
+      <w:r>
+        <w:t xml:space="preserve"> and never validated, or validated before the </w:t>
+      </w:r>
+      <w:r>
+        <w:rPr>
+          <w:rFonts w:ascii="Consolas" w:hAnsi="Consolas"/>
+          <w:color w:val="A31D1D"/>
+          <w:sz w:val="19"/>
+        </w:rPr>
+        <w:t>RevalidateAfterDays</w:t>
+      </w:r>
+      <w:r>
+        <w:t xml:space="preserve"> cutoff), ordered oldest-first.</w:t>
+      </w:r>
+    </w:p>
+    <w:p>
+      <w:pPr>
+        <w:spacing w:after="200"/>
+        <w:ind w:left="288"/>
+        <w:shd w:val="clear" w:color="auto" w:fill="FFF4CE"/>
+      </w:pPr>
+      <w:r>
+        <w:rPr>
+          <w:b/>
+        </w:rPr>
+        <w:t xml:space="preserve">Bug found and fixed during testing: </w:t>
+      </w:r>
+      <w:r>
+        <w:t xml:space="preserve">The first working version processed each batch sequentially — verified live against this project’s own local database: a single batch of 10 real leads took over 30 seconds, because a handful of slow or unresponsive domains each cost up to the full 5-second DNS timeout, one after another. Rewritten to run the batch’s network I/O concurrently via </w:t>
+      </w:r>
+      <w:r>
+        <w:rPr>
+          <w:rFonts w:ascii="Consolas" w:hAnsi="Consolas"/>
+          <w:color w:val="A31D1D"/>
+          <w:sz w:val="19"/>
+        </w:rPr>
+        <w:t>Parallel.ForEachAsync</w:t>
+      </w:r>
+      <w:r>
+        <w:t xml:space="preserve"> (bounded by </w:t>
+      </w:r>
+      <w:r>
+        <w:rPr>
+          <w:rFonts w:ascii="Consolas" w:hAnsi="Consolas"/>
+          <w:color w:val="A31D1D"/>
+          <w:sz w:val="19"/>
+        </w:rPr>
+        <w:t>BatchSize</w:t>
+      </w:r>
+      <w:r>
+        <w:t xml:space="preserve">), with every </w:t>
+      </w:r>
+      <w:r>
+        <w:rPr>
+          <w:rFonts w:ascii="Consolas" w:hAnsi="Consolas"/>
+          <w:color w:val="A31D1D"/>
+          <w:sz w:val="19"/>
+        </w:rPr>
+        <w:t>DbContext</w:t>
+      </w:r>
+      <w:r>
+        <w:t xml:space="preserve"> mutation and the single </w:t>
+      </w:r>
+      <w:r>
+        <w:rPr>
+          <w:rFonts w:ascii="Consolas" w:hAnsi="Consolas"/>
+          <w:color w:val="A31D1D"/>
+          <w:sz w:val="19"/>
+        </w:rPr>
+        <w:t>SaveChangesAsync</w:t>
+      </w:r>
+      <w:r>
+        <w:t xml:space="preserve"> call kept strictly sequential afterward, since EF Core’s </w:t>
+      </w:r>
+      <w:r>
+        <w:rPr>
+          <w:rFonts w:ascii="Consolas" w:hAnsi="Consolas"/>
+          <w:color w:val="A31D1D"/>
+          <w:sz w:val="19"/>
+        </w:rPr>
+        <w:t>DbContext</w:t>
+      </w:r>
+      <w:r>
+        <w:t xml:space="preserve"> is not thread-safe. Re-verified against the same live database: all 159 leads with an email were fully validated in roughly 20 seconds.</w:t>
+      </w:r>
+    </w:p>
+    <w:p>
+      <w:pPr>
+        <w:spacing w:after="160"/>
+      </w:pPr>
+      <w:r>
+        <w:t xml:space="preserve">No distributed lease the way </w:t>
+      </w:r>
+      <w:r>
+        <w:rPr>
+          <w:rFonts w:ascii="Consolas" w:hAnsi="Consolas"/>
+          <w:color w:val="A31D1D"/>
+          <w:sz w:val="19"/>
+        </w:rPr>
+        <w:t>SearchJob</w:t>
+      </w:r>
+      <w:r>
+        <w:t xml:space="preserve"> has one (§11): this app runs as a single process, and re-validating the same address twice in a race is harmless — it just recomputes the same result — unlike re-running a scrape.</w:t>
+      </w:r>
+    </w:p>
+    <w:p>
+      <w:pPr>
+        <w:pStyle w:val="Heading2"/>
+      </w:pPr>
+      <w:r>
+        <w:t>29.7  EmailBounceCheckWorkerService (the opt-in send-and-watch pass)</w:t>
+      </w:r>
+    </w:p>
+    <w:p>
+      <w:pPr>
+        <w:spacing w:after="160"/>
+      </w:pPr>
+      <w:r>
+        <w:t xml:space="preserve">A second </w:t>
+      </w:r>
+      <w:r>
+        <w:rPr>
+          <w:rFonts w:ascii="Consolas" w:hAnsi="Consolas"/>
+          <w:color w:val="A31D1D"/>
+          <w:sz w:val="19"/>
+        </w:rPr>
+        <w:t>BackgroundService</w:t>
+      </w:r>
+      <w:r>
+        <w:t xml:space="preserve">, idle and silent unless </w:t>
+      </w:r>
+      <w:r>
+        <w:rPr>
+          <w:rFonts w:ascii="Consolas" w:hAnsi="Consolas"/>
+          <w:color w:val="A31D1D"/>
+          <w:sz w:val="19"/>
+        </w:rPr>
+        <w:t>EnableBounceCheck</w:t>
+      </w:r>
+      <w:r>
+        <w:t xml:space="preserve"> is true and a mailbox is configured (confirmed live: it logs "disabled" and does nothing at all otherwise). Each tick runs three phases:</w:t>
+      </w:r>
+    </w:p>
+    <w:p>
+      <w:pPr>
+        <w:pStyle w:val="ListNumber"/>
+        <w:spacing w:after="60"/>
+      </w:pPr>
+      <w:r>
+        <w:t xml:space="preserve">**Time out stale checks** — any </w:t>
+      </w:r>
+      <w:r>
+        <w:rPr>
+          <w:rFonts w:ascii="Consolas" w:hAnsi="Consolas"/>
+          <w:color w:val="A31D1D"/>
+          <w:sz w:val="19"/>
+        </w:rPr>
+        <w:t>Pending</w:t>
+      </w:r>
+      <w:r>
+        <w:t xml:space="preserve"> row older than </w:t>
+      </w:r>
+      <w:r>
+        <w:rPr>
+          <w:rFonts w:ascii="Consolas" w:hAnsi="Consolas"/>
+          <w:color w:val="A31D1D"/>
+          <w:sz w:val="19"/>
+        </w:rPr>
+        <w:t>BounceCheckWaitHours</w:t>
+      </w:r>
+      <w:r>
+        <w:t xml:space="preserve"> is marked </w:t>
+      </w:r>
+      <w:r>
+        <w:rPr>
+          <w:rFonts w:ascii="Consolas" w:hAnsi="Consolas"/>
+          <w:color w:val="A31D1D"/>
+          <w:sz w:val="19"/>
+        </w:rPr>
+        <w:t>Confirmed</w:t>
+      </w:r>
+      <w:r>
+        <w:t xml:space="preserve"> and its lead’s </w:t>
+      </w:r>
+      <w:r>
+        <w:rPr>
+          <w:rFonts w:ascii="Consolas" w:hAnsi="Consolas"/>
+          <w:color w:val="A31D1D"/>
+          <w:sz w:val="19"/>
+        </w:rPr>
+        <w:t>EmailStatus</w:t>
+      </w:r>
+      <w:r>
+        <w:t xml:space="preserve"> is set </w:t>
+      </w:r>
+      <w:r>
+        <w:rPr>
+          <w:rFonts w:ascii="Consolas" w:hAnsi="Consolas"/>
+          <w:color w:val="A31D1D"/>
+          <w:sz w:val="19"/>
+        </w:rPr>
+        <w:t>Valid</w:t>
+      </w:r>
+      <w:r>
+        <w:t xml:space="preserve"> at confidence 99.</w:t>
+      </w:r>
+    </w:p>
+    <w:p>
+      <w:pPr>
+        <w:pStyle w:val="ListNumber"/>
+        <w:spacing w:after="60"/>
+      </w:pPr>
+      <w:r>
+        <w:t xml:space="preserve">**Send probes** — selects already-high-confidence, not-yet-checked leads up to whatever remains of the day’s and hour’s budget (capped at 5 sends per tick regardless, so a fresh restart with a full day’s headroom can’t burst the whole budget at once), sends a short one-line probe via MailKit SMTP, and records a </w:t>
+      </w:r>
+      <w:r>
+        <w:rPr>
+          <w:rFonts w:ascii="Consolas" w:hAnsi="Consolas"/>
+          <w:color w:val="A31D1D"/>
+          <w:sz w:val="19"/>
+        </w:rPr>
+        <w:t>Pending</w:t>
+      </w:r>
+      <w:r>
+        <w:t xml:space="preserve"> </w:t>
+      </w:r>
+      <w:r>
+        <w:rPr>
+          <w:rFonts w:ascii="Consolas" w:hAnsi="Consolas"/>
+          <w:color w:val="A31D1D"/>
+          <w:sz w:val="19"/>
+        </w:rPr>
+        <w:t>EmailBounceCheck</w:t>
+      </w:r>
+      <w:r>
+        <w:t xml:space="preserve"> row per send. One-shot per address — never retried.</w:t>
+      </w:r>
+    </w:p>
+    <w:p>
+      <w:pPr>
+        <w:pStyle w:val="ListNumber"/>
+        <w:spacing w:after="60"/>
+      </w:pPr>
+      <w:r>
+        <w:t xml:space="preserve">**Scan for bounces** — connects over IMAP, searches recent mail, and for each message tries the RFC 3464 structured delivery-status format first (what Gmail and most major providers send — the </w:t>
+      </w:r>
+      <w:r>
+        <w:rPr>
+          <w:rFonts w:ascii="Consolas" w:hAnsi="Consolas"/>
+          <w:color w:val="A31D1D"/>
+          <w:sz w:val="19"/>
+        </w:rPr>
+        <w:t>Final-Recipient</w:t>
+      </w:r>
+      <w:r>
+        <w:t>/</w:t>
+      </w:r>
+      <w:r>
+        <w:rPr>
+          <w:rFonts w:ascii="Consolas" w:hAnsi="Consolas"/>
+          <w:color w:val="A31D1D"/>
+          <w:sz w:val="19"/>
+        </w:rPr>
+        <w:t>Action</w:t>
+      </w:r>
+      <w:r>
+        <w:t xml:space="preserve"> fields give a precise match), falling back to From/subject heuristics (</w:t>
+      </w:r>
+      <w:r>
+        <w:rPr>
+          <w:rFonts w:ascii="Consolas" w:hAnsi="Consolas"/>
+          <w:color w:val="A31D1D"/>
+          <w:sz w:val="19"/>
+        </w:rPr>
+        <w:t>mailer-daemon</w:t>
+      </w:r>
+      <w:r>
+        <w:t xml:space="preserve">, </w:t>
+      </w:r>
+      <w:r>
+        <w:rPr>
+          <w:rFonts w:ascii="Consolas" w:hAnsi="Consolas"/>
+          <w:color w:val="A31D1D"/>
+          <w:sz w:val="19"/>
+        </w:rPr>
+        <w:t>postmaster</w:t>
+      </w:r>
+      <w:r>
+        <w:t xml:space="preserve">, "undeliverable", etc.) plus a plain-text body search against every still-pending address for servers that don’t send a structured bounce. A match marks the check </w:t>
+      </w:r>
+      <w:r>
+        <w:rPr>
+          <w:rFonts w:ascii="Consolas" w:hAnsi="Consolas"/>
+          <w:color w:val="A31D1D"/>
+          <w:sz w:val="19"/>
+        </w:rPr>
+        <w:t>Bounced</w:t>
+      </w:r>
+      <w:r>
+        <w:t xml:space="preserve"> and the lead </w:t>
+      </w:r>
+      <w:r>
+        <w:rPr>
+          <w:rFonts w:ascii="Consolas" w:hAnsi="Consolas"/>
+          <w:color w:val="A31D1D"/>
+          <w:sz w:val="19"/>
+        </w:rPr>
+        <w:t>Invalid</w:t>
+      </w:r>
+      <w:r>
+        <w:t>.</w:t>
+      </w:r>
+    </w:p>
+    <w:p>
+      <w:pPr>
+        <w:pStyle w:val="Heading2"/>
+      </w:pPr>
+      <w:r>
+        <w:t>29.8  Checking It’s Running</w:t>
+      </w:r>
+    </w:p>
+    <w:p>
+      <w:pPr>
+        <w:spacing w:after="160"/>
+      </w:pPr>
+      <w:r>
+        <w:t>Neither worker is a separate OS service — both run inside the same API process, so "checking" them means logs or a direct database query, not a service manager.</w:t>
+      </w:r>
+    </w:p>
+    <w:p>
+      <w:pPr>
+        <w:pStyle w:val="ListBullet"/>
+        <w:spacing w:after="60"/>
+      </w:pPr>
+      <w:r>
+        <w:t xml:space="preserve">**Logs**: on startup, one line per worker — </w:t>
+      </w:r>
+      <w:r>
+        <w:rPr>
+          <w:rFonts w:ascii="Consolas" w:hAnsi="Consolas"/>
+          <w:color w:val="A31D1D"/>
+          <w:sz w:val="19"/>
+        </w:rPr>
+        <w:t>Email validation worker started</w:t>
+      </w:r>
+      <w:r>
+        <w:t xml:space="preserve"> and either </w:t>
+      </w:r>
+      <w:r>
+        <w:rPr>
+          <w:rFonts w:ascii="Consolas" w:hAnsi="Consolas"/>
+          <w:color w:val="A31D1D"/>
+          <w:sz w:val="19"/>
+        </w:rPr>
+        <w:t>Email bounce-check worker started</w:t>
+      </w:r>
+      <w:r>
+        <w:t xml:space="preserve"> or </w:t>
+      </w:r>
+      <w:r>
+        <w:rPr>
+          <w:rFonts w:ascii="Consolas" w:hAnsi="Consolas"/>
+          <w:color w:val="A31D1D"/>
+          <w:sz w:val="19"/>
+        </w:rPr>
+        <w:t>...disabled (EmailValidation:EnableBounceCheck = false)</w:t>
+      </w:r>
+      <w:r>
+        <w:t xml:space="preserve">. Serilog here is console-only; on a Plesk/IIS deployment that needs </w:t>
+      </w:r>
+      <w:r>
+        <w:rPr>
+          <w:rFonts w:ascii="Consolas" w:hAnsi="Consolas"/>
+          <w:color w:val="A31D1D"/>
+          <w:sz w:val="19"/>
+        </w:rPr>
+        <w:t>stdoutLogEnabled</w:t>
+      </w:r>
+      <w:r>
+        <w:t xml:space="preserve"> in </w:t>
+      </w:r>
+      <w:r>
+        <w:rPr>
+          <w:rFonts w:ascii="Consolas" w:hAnsi="Consolas"/>
+          <w:color w:val="A31D1D"/>
+          <w:sz w:val="19"/>
+        </w:rPr>
+        <w:t>web.config</w:t>
+      </w:r>
+      <w:r>
+        <w:t xml:space="preserve"> to be captured anywhere.</w:t>
+      </w:r>
+    </w:p>
+    <w:p>
+      <w:pPr>
+        <w:pStyle w:val="ListBullet"/>
+        <w:spacing w:after="60"/>
+      </w:pPr>
+      <w:r>
+        <w:t xml:space="preserve">**Database (works anywhere, no log access needed)**: </w:t>
+      </w:r>
+      <w:r>
+        <w:rPr>
+          <w:rFonts w:ascii="Consolas" w:hAnsi="Consolas"/>
+          <w:color w:val="A31D1D"/>
+          <w:sz w:val="19"/>
+        </w:rPr>
+        <w:t>SELECT COUNT(*), SUM(CASE WHEN EmailValidatedAt IS NOT NULL THEN 1 ELSE 0 END), MAX(EmailValidatedAt) FROM Businesses WHERE Email &lt;&gt; ''</w:t>
+      </w:r>
+      <w:r>
+        <w:t xml:space="preserve"> — </w:t>
+      </w:r>
+      <w:r>
+        <w:rPr>
+          <w:rFonts w:ascii="Consolas" w:hAnsi="Consolas"/>
+          <w:color w:val="A31D1D"/>
+          <w:sz w:val="19"/>
+        </w:rPr>
+        <w:t>MostRecentValidation</w:t>
+      </w:r>
+      <w:r>
+        <w:t xml:space="preserve"> advancing over repeated checks confirms the fast pass is alive. </w:t>
+      </w:r>
+      <w:r>
+        <w:rPr>
+          <w:rFonts w:ascii="Consolas" w:hAnsi="Consolas"/>
+          <w:color w:val="A31D1D"/>
+          <w:sz w:val="19"/>
+        </w:rPr>
+        <w:t>SELECT Status, COUNT(*), MAX(SentAt) FROM EmailBounceChecks GROUP BY Status</w:t>
+      </w:r>
+      <w:r>
+        <w:t xml:space="preserve"> — rows appearing (or moving from </w:t>
+      </w:r>
+      <w:r>
+        <w:rPr>
+          <w:rFonts w:ascii="Consolas" w:hAnsi="Consolas"/>
+          <w:color w:val="A31D1D"/>
+          <w:sz w:val="19"/>
+        </w:rPr>
+        <w:t>Pending</w:t>
+      </w:r>
+      <w:r>
+        <w:t xml:space="preserve"> to </w:t>
+      </w:r>
+      <w:r>
+        <w:rPr>
+          <w:rFonts w:ascii="Consolas" w:hAnsi="Consolas"/>
+          <w:color w:val="A31D1D"/>
+          <w:sz w:val="19"/>
+        </w:rPr>
+        <w:t>Confirmed</w:t>
+      </w:r>
+      <w:r>
+        <w:t>/</w:t>
+      </w:r>
+      <w:r>
+        <w:rPr>
+          <w:rFonts w:ascii="Consolas" w:hAnsi="Consolas"/>
+          <w:color w:val="A31D1D"/>
+          <w:sz w:val="19"/>
+        </w:rPr>
+        <w:t>Bounced</w:t>
+      </w:r>
+      <w:r>
+        <w:t>) confirms the bounce-check pass is alive; an empty result is the expected, healthy state while it’s disabled.</w:t>
+      </w:r>
+    </w:p>
+    <w:p>
+      <w:pPr>
+        <w:pStyle w:val="ListBullet"/>
+        <w:spacing w:after="60"/>
+      </w:pPr>
+      <w:r>
+        <w:t xml:space="preserve">**Debugging**: since this is a background loop rather than a request handler, breaking anywhere in </w:t>
+      </w:r>
+      <w:r>
+        <w:rPr>
+          <w:rFonts w:ascii="Consolas" w:hAnsi="Consolas"/>
+          <w:color w:val="A31D1D"/>
+          <w:sz w:val="19"/>
+        </w:rPr>
+        <w:t>EmailValidationWorkerService.ValidateBatchAsync</w:t>
+      </w:r>
+      <w:r>
+        <w:t xml:space="preserve"> or </w:t>
+      </w:r>
+      <w:r>
+        <w:rPr>
+          <w:rFonts w:ascii="Consolas" w:hAnsi="Consolas"/>
+          <w:color w:val="A31D1D"/>
+          <w:sz w:val="19"/>
+        </w:rPr>
+        <w:t>EmailValidationPipeline.ValidateAsync</w:t>
+      </w:r>
+      <w:r>
+        <w:t xml:space="preserve"> will be hit within ~8 seconds of starting the debugger, and roughly every second after — pausing there pauses the whole process, including HTTP handling, which is expected for a single-process host. A conditional breakpoint on the lead’s email address keeps the constant tick rate from being noisy while stepping through one specific case.</w:t>
+      </w:r>
+    </w:p>
+    <w:p>
+      <w:pPr>
+        <w:pStyle w:val="Heading2"/>
+      </w:pPr>
+      <w:r>
+        <w:t>29.9  Risk Notes</w:t>
+      </w:r>
+    </w:p>
+    <w:p>
+      <w:pPr>
+        <w:spacing w:after="200"/>
+        <w:ind w:left="288"/>
+        <w:shd w:val="clear" w:color="auto" w:fill="FFF4CE"/>
+      </w:pPr>
+      <w:r>
+        <w:rPr>
+          <w:b/>
+        </w:rPr>
+        <w:t xml:space="preserve">Credential storage: </w:t>
+      </w:r>
+      <w:r>
+        <w:t xml:space="preserve">The bounce-check mailbox’s app password is committed directly in </w:t>
+      </w:r>
+      <w:r>
+        <w:rPr>
+          <w:rFonts w:ascii="Consolas" w:hAnsi="Consolas"/>
+          <w:color w:val="A31D1D"/>
+          <w:sz w:val="19"/>
+        </w:rPr>
+        <w:t>appsettings.Development.json</w:t>
+      </w:r>
+      <w:r>
+        <w:t xml:space="preserve"> and </w:t>
+      </w:r>
+      <w:r>
+        <w:rPr>
+          <w:rFonts w:ascii="Consolas" w:hAnsi="Consolas"/>
+          <w:color w:val="A31D1D"/>
+          <w:sz w:val="19"/>
+        </w:rPr>
+        <w:t>appsettings.Production.json</w:t>
+      </w:r>
+      <w:r>
+        <w:t xml:space="preserve">, matching this project’s existing convention for Production (§10, §22) rather than </w:t>
+      </w:r>
+      <w:r>
+        <w:rPr>
+          <w:rFonts w:ascii="Consolas" w:hAnsi="Consolas"/>
+          <w:color w:val="A31D1D"/>
+          <w:sz w:val="19"/>
+        </w:rPr>
+        <w:t>dotnet user-secrets</w:t>
+      </w:r>
+      <w:r>
+        <w:t xml:space="preserve"> — a deliberate choice made when this feature was added, not an oversight.</w:t>
+      </w:r>
+    </w:p>
+    <w:p>
+      <w:pPr>
+        <w:spacing w:after="200"/>
+        <w:ind w:left="288"/>
+        <w:shd w:val="clear" w:color="auto" w:fill="FFF4CE"/>
+      </w:pPr>
+      <w:r>
+        <w:rPr>
+          <w:b/>
+        </w:rPr>
+        <w:t xml:space="preserve">SMTP probe risk (Tier 2): </w:t>
+      </w:r>
+      <w:r>
+        <w:t xml:space="preserve">Off by default. </w:t>
+      </w:r>
+      <w:r>
+        <w:rPr>
+          <w:rFonts w:ascii="Consolas" w:hAnsi="Consolas"/>
+          <w:color w:val="A31D1D"/>
+          <w:sz w:val="19"/>
+        </w:rPr>
+        <w:t>EmailVerifier</w:t>
+      </w:r>
+      <w:r>
+        <w:t>’s own remarks already covered why: providers lie about RCPT TO results, catch-all domains defeat it, and probing at volume risks the sending IP being blacklisted — which would hurt deliverability for every legitimate send this app makes afterward, not just this lookup. The per-domain-per-hour cap reduces that risk when enabled; it does not eliminate it.</w:t>
+      </w:r>
+    </w:p>
+    <w:p>
+      <w:pPr>
+        <w:spacing w:after="200"/>
+        <w:ind w:left="288"/>
+        <w:shd w:val="clear" w:color="auto" w:fill="FFF4CE"/>
+      </w:pPr>
+      <w:r>
+        <w:rPr>
+          <w:b/>
+        </w:rPr>
+        <w:t xml:space="preserve">Bounce-check risk (Tier 3): </w:t>
+      </w:r>
+      <w:r>
+        <w:t>Off by default, and capped (400/day, 40/hour) even when enabled. This tier sends real, unsolicited mail to every lead it checks, from a real account — functionally a small outbound campaign. An account that trips a provider’s abuse detection (many sends in a short window, to many different domains, followed by an abnormal bounce rate — exactly this pattern) can be suspended or held, at which point the feature stops working entirely regardless of the caps in place. Raise the caps only with real confidence in the mailbox’s sending reputation and headroom.</w:t>
       </w:r>
     </w:p>
     <w:p>

</xml_diff>